<commit_message>
Anexo viabilidad economica y eliminar anexo provisional
</commit_message>
<xml_diff>
--- a/DocumentosTFG/Anexos TFG.docx
+++ b/DocumentosTFG/Anexos TFG.docx
@@ -14,7 +14,7 @@
           <w:shd w:val="clear" w:color="auto" w:fill="FFFFFF"/>
         </w:rPr>
         <w:drawing>
-          <wp:inline distT="0" distB="0" distL="0" distR="0" wp14:anchorId="6CBCFA8F" wp14:editId="10A4AD11">
+          <wp:inline distT="0" distB="0" distL="0" distR="0" wp14:anchorId="6CBCFA8F" wp14:editId="1EF4C489">
             <wp:extent cx="5400040" cy="1184275"/>
             <wp:effectExtent l="0" t="0" r="0" b="0"/>
             <wp:docPr id="1764844086" name="Imagen 1" descr="Interfaz de usuario gráfica, Texto&#10;&#10;Descripción generada automáticamente con confianza media"/>
@@ -31,7 +31,7 @@
                     </pic:cNvPicPr>
                   </pic:nvPicPr>
                   <pic:blipFill>
-                    <a:blip r:embed="rId6" cstate="print">
+                    <a:blip r:embed="rId8" cstate="print">
                       <a:extLst>
                         <a:ext uri="{28A0092B-C50C-407E-A947-70E740481C1C}">
                           <a14:useLocalDpi xmlns:a14="http://schemas.microsoft.com/office/drawing/2010/main" val="0"/>
@@ -88,7 +88,7 @@
                     </pic:cNvPicPr>
                   </pic:nvPicPr>
                   <pic:blipFill>
-                    <a:blip r:embed="rId7">
+                    <a:blip r:embed="rId9">
                       <a:extLst>
                         <a:ext uri="{28A0092B-C50C-407E-A947-70E740481C1C}">
                           <a14:useLocalDpi xmlns:a14="http://schemas.microsoft.com/office/drawing/2010/main" val="0"/>
@@ -142,7 +142,7 @@
                     </pic:cNvPicPr>
                   </pic:nvPicPr>
                   <pic:blipFill>
-                    <a:blip r:embed="rId8">
+                    <a:blip r:embed="rId10">
                       <a:extLst>
                         <a:ext uri="{28A0092B-C50C-407E-A947-70E740481C1C}">
                           <a14:useLocalDpi xmlns:a14="http://schemas.microsoft.com/office/drawing/2010/main" val="0"/>
@@ -308,8 +308,19 @@
           <w:sz w:val="36"/>
           <w:szCs w:val="36"/>
         </w:rPr>
-        <w:t>de Enero</w:t>
-      </w:r>
+        <w:t xml:space="preserve">de </w:t>
+      </w:r>
+      <w:proofErr w:type="gramStart"/>
+      <w:r>
+        <w:rPr>
+          <w:rStyle w:val="normaltextrun"/>
+          <w:rFonts w:ascii="Calibri" w:eastAsiaTheme="majorEastAsia" w:hAnsi="Calibri" w:cs="Calibri"/>
+          <w:sz w:val="36"/>
+          <w:szCs w:val="36"/>
+        </w:rPr>
+        <w:t>Enero</w:t>
+      </w:r>
+      <w:proofErr w:type="gramEnd"/>
       <w:r>
         <w:rPr>
           <w:rStyle w:val="normaltextrun"/>
@@ -2632,49 +2643,958 @@
     </w:p>
     <w:p>
       <w:r>
-        <w:t xml:space="preserve">Respecto al tema económico al ser una APP para TFG no se busca una monetización al uso como si se </w:t>
-      </w:r>
-      <w:r>
-        <w:t>buscase</w:t>
-      </w:r>
-      <w:r>
-        <w:t xml:space="preserve"> en una APP fuera de este contexto, con lo cual </w:t>
-      </w:r>
-      <w:r>
-        <w:t xml:space="preserve">no está pensada la monetización. La única forma monetaria de obtener algún retorno sería mediante Noticias que conlleven anuncios, pero no sería muy apropiado, debido a que solo esta pensado que se pueda notificar a los usuarios en modo campaña o noticias referentes a las votaciones, nunca como publicidad. </w:t>
-      </w:r>
-    </w:p>
-    <w:p>
-      <w:r>
-        <w:t xml:space="preserve">No </w:t>
-      </w:r>
-      <w:r>
-        <w:t>obstante,</w:t>
-      </w:r>
-      <w:r>
-        <w:t xml:space="preserve"> al ser una aplicación web que debe de </w:t>
-      </w:r>
-      <w:r>
-        <w:t>estar alojada en un servidor hay que tener en cuenta los posibles costes asociados al mantenimiento de esto, si bien pueden ser recursos propios de la persona/empresa que desee utilizar la APP.</w:t>
-      </w:r>
-    </w:p>
-    <w:p>
-      <w:r>
-        <w:t xml:space="preserve">Existen varias soluciones similares para </w:t>
-      </w:r>
-      <w:r>
-        <w:t xml:space="preserve">votaciones, pero la gran mayoría son de pago, al ser esto una opción </w:t>
+        <w:t>Para analizar la viabilidad económica de la APP, utilizaremos un BMC</w:t>
+      </w:r>
+      <w:r>
+        <w:rPr>
+          <w:rStyle w:val="Refdenotaalpie"/>
+        </w:rPr>
+        <w:footnoteReference w:id="1"/>
+      </w:r>
+      <w:r>
+        <w:t xml:space="preserve"> (</w:t>
+      </w:r>
+      <w:r>
+        <w:t>Bussiness Model Canvas</w:t>
+      </w:r>
+      <w:r>
+        <w:t xml:space="preserve">). Es una herramienta visual creada por Alexander Osterwalder. Permite estructurar y explicar de forma clara un modelo de negocio de una forma breve y clara. Esta organizado en 9 bloques distintos que abarcan los fundamentos de cualquier iniciativa: Clientes, Propuesta de Valor, Canales, Relaciones, Fuentes de Ingresos, Recursos, Actividades, Socios y Estructura de costos. </w:t>
+      </w:r>
+    </w:p>
+    <w:p>
+      <w:r>
+        <w:t>En este caso nos facilita de un vistazo rápido y global para que se comprenda</w:t>
+      </w:r>
+      <w:r>
+        <w:t xml:space="preserve"> el modelo y sea accesible a cualquier público.</w:t>
+      </w:r>
+    </w:p>
+    <w:p>
+      <w:r>
+        <w:t>Es una buena opción para mostrar este estudio económico por su simplicidad visual</w:t>
+      </w:r>
+      <w:r>
+        <w:t xml:space="preserve"> </w:t>
+      </w:r>
+      <w:r>
+        <w:t xml:space="preserve">(resume todos los elementos clave), es </w:t>
+      </w:r>
+      <w:r>
+        <w:t>flexible (</w:t>
+      </w:r>
+      <w:r>
+        <w:t xml:space="preserve">vale para cualquier tipo de </w:t>
+      </w:r>
+      <w:r>
+        <w:t>organización</w:t>
+      </w:r>
+      <w:r>
+        <w:t>), es colaborativo y comparativo.</w:t>
+      </w:r>
+      <w:r>
+        <w:rPr>
+          <w:rStyle w:val="Refdenotaalpie"/>
+        </w:rPr>
+        <w:footnoteReference w:id="2"/>
+      </w:r>
+    </w:p>
+    <w:p>
+      <w:r>
+        <w:t>Con este modelo definimos una propuesta de valor segura auditable y gratuita</w:t>
+      </w:r>
+      <w:r>
+        <w:t>. Identificamos a los usuarios potenciales, visualizamos los recursos y actividades clave</w:t>
+      </w:r>
+      <w:r>
+        <w:t xml:space="preserve"> y además planteamos un esquema de sostenibilidad. Lo cual de forma ordenada y comprensible analiza el escenario real que se nos presenta, reforzando la validez del trabajo.</w:t>
+      </w:r>
+    </w:p>
+    <w:p>
+      <w:r>
+        <w:t>Desa</w:t>
+      </w:r>
+      <w:r>
+        <w:t>rr</w:t>
+      </w:r>
+      <w:r>
+        <w:t>o</w:t>
+      </w:r>
+      <w:r>
+        <w:t>ll</w:t>
+      </w:r>
+      <w:r>
+        <w:t>amos el análisis:</w:t>
+      </w:r>
+    </w:p>
+    <w:p>
+      <w:pPr>
+        <w:pStyle w:val="Prrafodelista"/>
+        <w:numPr>
+          <w:ilvl w:val="0"/>
+          <w:numId w:val="7"/>
+        </w:numPr>
+        <w:rPr>
+          <w:b/>
+          <w:bCs/>
+        </w:rPr>
+      </w:pPr>
+      <w:r>
+        <w:rPr>
+          <w:b/>
+          <w:bCs/>
+        </w:rPr>
+        <w:t>Propuesta de Valor</w:t>
+      </w:r>
+    </w:p>
+    <w:p>
+      <w:pPr>
+        <w:pStyle w:val="Prrafodelista"/>
+        <w:numPr>
+          <w:ilvl w:val="1"/>
+          <w:numId w:val="7"/>
+        </w:numPr>
+      </w:pPr>
+      <w:r>
+        <w:t xml:space="preserve">Plataforma segura y transparente para realizar votaciones telemáticas mediante certificados electrónicos de CA o </w:t>
       </w:r>
       <w:proofErr w:type="spellStart"/>
       <w:r>
-        <w:t>freemiun</w:t>
+        <w:t>autofirmados</w:t>
       </w:r>
       <w:proofErr w:type="spellEnd"/>
       <w:r>
-        <w:t xml:space="preserve"> tendríamos la ventaja competitiva de que tendría mas uso que el resto en caso de buscarse una relación </w:t>
+        <w:t>, elegibles en función del tipo de votación.</w:t>
+      </w:r>
+    </w:p>
+    <w:p>
+      <w:pPr>
+        <w:pStyle w:val="Prrafodelista"/>
+        <w:numPr>
+          <w:ilvl w:val="1"/>
+          <w:numId w:val="7"/>
+        </w:numPr>
+      </w:pPr>
+      <w:r>
+        <w:lastRenderedPageBreak/>
+        <w:t>Código abierto y gratuito</w:t>
+      </w:r>
+      <w:r>
+        <w:t xml:space="preserve"> que genera confianza, auditabilidad y sin depender de un proveedor cerrado.</w:t>
+      </w:r>
+    </w:p>
+    <w:p>
+      <w:pPr>
+        <w:pStyle w:val="Prrafodelista"/>
+        <w:numPr>
+          <w:ilvl w:val="1"/>
+          <w:numId w:val="7"/>
+        </w:numPr>
+      </w:pPr>
+      <w:r>
+        <w:t>Adaptable a cualquier tipo de organización.</w:t>
+      </w:r>
+    </w:p>
+    <w:p>
+      <w:pPr>
+        <w:pStyle w:val="Prrafodelista"/>
+        <w:numPr>
+          <w:ilvl w:val="1"/>
+          <w:numId w:val="7"/>
+        </w:numPr>
+      </w:pPr>
+      <w:r>
+        <w:t>Mucho más económico que soluciones privadas cerradas</w:t>
+      </w:r>
+    </w:p>
+    <w:p>
+      <w:pPr>
+        <w:pStyle w:val="Prrafodelista"/>
+        <w:numPr>
+          <w:ilvl w:val="0"/>
+          <w:numId w:val="7"/>
+        </w:numPr>
+        <w:rPr>
+          <w:b/>
+          <w:bCs/>
+        </w:rPr>
+      </w:pPr>
+      <w:r>
+        <w:rPr>
+          <w:b/>
+          <w:bCs/>
+        </w:rPr>
+        <w:t>Segmentos de clientes</w:t>
+      </w:r>
+    </w:p>
+    <w:p>
+      <w:pPr>
+        <w:pStyle w:val="Prrafodelista"/>
+        <w:numPr>
+          <w:ilvl w:val="1"/>
+          <w:numId w:val="7"/>
+        </w:numPr>
+        <w:rPr>
+          <w:b/>
+          <w:bCs/>
+        </w:rPr>
+      </w:pPr>
+      <w:r>
+        <w:t xml:space="preserve">Organizaciones grandes como universidades, sindicatos, </w:t>
+      </w:r>
+      <w:proofErr w:type="spellStart"/>
+      <w:r>
+        <w:t>ONG’s</w:t>
+      </w:r>
+      <w:proofErr w:type="spellEnd"/>
+      <w:r>
+        <w:t xml:space="preserve"> …</w:t>
+      </w:r>
+    </w:p>
+    <w:p>
+      <w:pPr>
+        <w:pStyle w:val="Prrafodelista"/>
+        <w:numPr>
+          <w:ilvl w:val="1"/>
+          <w:numId w:val="7"/>
+        </w:numPr>
+        <w:rPr>
+          <w:b/>
+          <w:bCs/>
+        </w:rPr>
+      </w:pPr>
+      <w:r>
+        <w:t>Organizaciones medianas como asociaciones, clubes deportivos, comunidades de propietarios …</w:t>
+      </w:r>
+    </w:p>
+    <w:p>
+      <w:pPr>
+        <w:pStyle w:val="Prrafodelista"/>
+        <w:numPr>
+          <w:ilvl w:val="1"/>
+          <w:numId w:val="7"/>
+        </w:numPr>
+        <w:rPr>
+          <w:b/>
+          <w:bCs/>
+        </w:rPr>
+      </w:pPr>
+      <w:r>
+        <w:t>Organizaciones pequeñas como grupos de trabajo, juntas …</w:t>
+      </w:r>
+    </w:p>
+    <w:p>
+      <w:pPr>
+        <w:pStyle w:val="Prrafodelista"/>
+        <w:numPr>
+          <w:ilvl w:val="0"/>
+          <w:numId w:val="7"/>
+        </w:numPr>
+        <w:rPr>
+          <w:b/>
+          <w:bCs/>
+        </w:rPr>
+      </w:pPr>
+      <w:r>
+        <w:rPr>
+          <w:b/>
+          <w:bCs/>
+        </w:rPr>
+        <w:t>Canales</w:t>
+      </w:r>
+    </w:p>
+    <w:p>
+      <w:pPr>
+        <w:pStyle w:val="Prrafodelista"/>
+        <w:numPr>
+          <w:ilvl w:val="1"/>
+          <w:numId w:val="7"/>
+        </w:numPr>
+      </w:pPr>
+      <w:r>
+        <w:t>Acceso vía plataforma web</w:t>
+      </w:r>
+      <w:r>
+        <w:t xml:space="preserve"> (SaaS o despliegue propio)</w:t>
+      </w:r>
+    </w:p>
+    <w:p>
+      <w:pPr>
+        <w:pStyle w:val="Prrafodelista"/>
+        <w:numPr>
+          <w:ilvl w:val="1"/>
+          <w:numId w:val="7"/>
+        </w:numPr>
+      </w:pPr>
+      <w:r>
+        <w:t>Difusión en comunidades de software libre</w:t>
+      </w:r>
+    </w:p>
+    <w:p>
+      <w:pPr>
+        <w:pStyle w:val="Prrafodelista"/>
+        <w:numPr>
+          <w:ilvl w:val="1"/>
+          <w:numId w:val="7"/>
+        </w:numPr>
+      </w:pPr>
+      <w:r>
+        <w:t>Contacto directo con organizaciones</w:t>
+      </w:r>
+    </w:p>
+    <w:p>
+      <w:pPr>
+        <w:pStyle w:val="Prrafodelista"/>
+        <w:numPr>
+          <w:ilvl w:val="1"/>
+          <w:numId w:val="7"/>
+        </w:numPr>
+        <w:rPr>
+          <w:b/>
+          <w:bCs/>
+        </w:rPr>
+      </w:pPr>
+      <w:r>
+        <w:t>Repositorio público (GitHub)</w:t>
+      </w:r>
+    </w:p>
+    <w:p>
+      <w:pPr>
+        <w:pStyle w:val="Prrafodelista"/>
+        <w:numPr>
+          <w:ilvl w:val="0"/>
+          <w:numId w:val="7"/>
+        </w:numPr>
+      </w:pPr>
+      <w:r>
+        <w:t>Relación con Clientes</w:t>
+      </w:r>
+    </w:p>
+    <w:p>
+      <w:pPr>
+        <w:pStyle w:val="Prrafodelista"/>
+        <w:numPr>
+          <w:ilvl w:val="1"/>
+          <w:numId w:val="7"/>
+        </w:numPr>
+      </w:pPr>
+      <w:r>
+        <w:t>Autoservicio (documentación, tutoriales o foros)</w:t>
+      </w:r>
+    </w:p>
+    <w:p>
+      <w:pPr>
+        <w:pStyle w:val="Prrafodelista"/>
+        <w:numPr>
+          <w:ilvl w:val="1"/>
+          <w:numId w:val="7"/>
+        </w:numPr>
+      </w:pPr>
+      <w:r>
+        <w:t>Comunidad con soporte colaborativo</w:t>
+      </w:r>
+    </w:p>
+    <w:p>
+      <w:pPr>
+        <w:pStyle w:val="Prrafodelista"/>
+        <w:numPr>
+          <w:ilvl w:val="1"/>
+          <w:numId w:val="7"/>
+        </w:numPr>
+      </w:pPr>
+      <w:r>
+        <w:t>Posibilidad de soporte técnico opcional, con posible monetización</w:t>
+      </w:r>
+    </w:p>
+    <w:p>
+      <w:pPr>
+        <w:pStyle w:val="Prrafodelista"/>
+        <w:numPr>
+          <w:ilvl w:val="0"/>
+          <w:numId w:val="7"/>
+        </w:numPr>
+      </w:pPr>
+      <w:r>
+        <w:t>Fuentes de Ingreso / Sostenibilidad</w:t>
+      </w:r>
+    </w:p>
+    <w:p>
+      <w:pPr>
+        <w:pStyle w:val="Prrafodelista"/>
+        <w:numPr>
+          <w:ilvl w:val="1"/>
+          <w:numId w:val="7"/>
+        </w:numPr>
+      </w:pPr>
+      <w:r>
+        <w:t>Modelo abierto en el que cada organización puede desplegar su propia infraestructura</w:t>
+      </w:r>
+    </w:p>
+    <w:p>
+      <w:pPr>
+        <w:pStyle w:val="Prrafodelista"/>
+        <w:numPr>
+          <w:ilvl w:val="1"/>
+          <w:numId w:val="7"/>
+        </w:numPr>
+      </w:pPr>
+      <w:r>
+        <w:t>Ingresos indirectos vía hosting gestionado, soporte técnico, subvenciones o convenios.</w:t>
+      </w:r>
+    </w:p>
+    <w:p>
+      <w:pPr>
+        <w:pStyle w:val="Prrafodelista"/>
+        <w:numPr>
+          <w:ilvl w:val="0"/>
+          <w:numId w:val="7"/>
+        </w:numPr>
+      </w:pPr>
+      <w:r>
+        <w:t>Recursos clave</w:t>
+      </w:r>
+    </w:p>
+    <w:p>
+      <w:pPr>
+        <w:pStyle w:val="Prrafodelista"/>
+        <w:numPr>
+          <w:ilvl w:val="1"/>
+          <w:numId w:val="7"/>
+        </w:numPr>
+      </w:pPr>
+      <w:r>
+        <w:t>Equipo de desarrollo y mantenimiento</w:t>
+      </w:r>
+    </w:p>
+    <w:p>
+      <w:pPr>
+        <w:pStyle w:val="Prrafodelista"/>
+        <w:numPr>
+          <w:ilvl w:val="1"/>
+          <w:numId w:val="7"/>
+        </w:numPr>
+      </w:pPr>
+      <w:r>
+        <w:t>Servidores e infraestructura en la nube.</w:t>
+      </w:r>
+    </w:p>
+    <w:p>
+      <w:pPr>
+        <w:pStyle w:val="Prrafodelista"/>
+        <w:numPr>
+          <w:ilvl w:val="1"/>
+          <w:numId w:val="7"/>
+        </w:numPr>
+      </w:pPr>
+      <w:r>
+        <w:t>Certificados electrónicos y cumplimiento legal</w:t>
+      </w:r>
+    </w:p>
+    <w:p>
+      <w:pPr>
+        <w:pStyle w:val="Prrafodelista"/>
+        <w:numPr>
+          <w:ilvl w:val="1"/>
+          <w:numId w:val="7"/>
+        </w:numPr>
+      </w:pPr>
+      <w:r>
+        <w:t>Comunidad de usuarios y desarrolladores</w:t>
+      </w:r>
+    </w:p>
+    <w:p>
+      <w:pPr>
+        <w:pStyle w:val="Prrafodelista"/>
+        <w:numPr>
+          <w:ilvl w:val="0"/>
+          <w:numId w:val="7"/>
+        </w:numPr>
+      </w:pPr>
+      <w:r>
+        <w:t>Actividades Clave</w:t>
+      </w:r>
+    </w:p>
+    <w:p>
+      <w:pPr>
+        <w:pStyle w:val="Prrafodelista"/>
+        <w:numPr>
+          <w:ilvl w:val="1"/>
+          <w:numId w:val="7"/>
+        </w:numPr>
+      </w:pPr>
+      <w:r>
+        <w:t>Desarrollo y mantenimiento del software</w:t>
+      </w:r>
+    </w:p>
+    <w:p>
+      <w:pPr>
+        <w:pStyle w:val="Prrafodelista"/>
+        <w:numPr>
+          <w:ilvl w:val="1"/>
+          <w:numId w:val="7"/>
+        </w:numPr>
+      </w:pPr>
+      <w:r>
+        <w:t>Seguridad, cifrado y auditoria</w:t>
+      </w:r>
+    </w:p>
+    <w:p>
+      <w:pPr>
+        <w:pStyle w:val="Prrafodelista"/>
+        <w:numPr>
+          <w:ilvl w:val="1"/>
+          <w:numId w:val="7"/>
+        </w:numPr>
+      </w:pPr>
+      <w:r>
+        <w:t>Documentación y comunidad de código abierto</w:t>
+      </w:r>
+    </w:p>
+    <w:p>
+      <w:pPr>
+        <w:pStyle w:val="Prrafodelista"/>
+        <w:numPr>
+          <w:ilvl w:val="1"/>
+          <w:numId w:val="7"/>
+        </w:numPr>
+      </w:pPr>
+      <w:r>
+        <w:t>Gestión de despliegues (si ofrecemos hosting)</w:t>
+      </w:r>
+    </w:p>
+    <w:p>
+      <w:pPr>
+        <w:pStyle w:val="Prrafodelista"/>
+        <w:numPr>
+          <w:ilvl w:val="0"/>
+          <w:numId w:val="7"/>
+        </w:numPr>
+      </w:pPr>
+      <w:r>
+        <w:t>Socios Clave</w:t>
+      </w:r>
+    </w:p>
+    <w:p>
+      <w:pPr>
+        <w:pStyle w:val="Prrafodelista"/>
+        <w:numPr>
+          <w:ilvl w:val="1"/>
+          <w:numId w:val="7"/>
+        </w:numPr>
+      </w:pPr>
+      <w:r>
+        <w:t>Organismos que promuevan transparencia y democracia digital</w:t>
+      </w:r>
+    </w:p>
+    <w:p>
+      <w:pPr>
+        <w:pStyle w:val="Prrafodelista"/>
+        <w:numPr>
+          <w:ilvl w:val="1"/>
+          <w:numId w:val="7"/>
+        </w:numPr>
+      </w:pPr>
+      <w:r>
+        <w:t>Universidades y colegios profesionales</w:t>
+      </w:r>
+    </w:p>
+    <w:p>
+      <w:pPr>
+        <w:pStyle w:val="Prrafodelista"/>
+        <w:numPr>
+          <w:ilvl w:val="1"/>
+          <w:numId w:val="7"/>
+        </w:numPr>
+      </w:pPr>
+      <w:r>
+        <w:t xml:space="preserve">Empresas </w:t>
+      </w:r>
+      <w:proofErr w:type="spellStart"/>
+      <w:proofErr w:type="gramStart"/>
+      <w:r>
+        <w:t>cloud</w:t>
+      </w:r>
+      <w:proofErr w:type="spellEnd"/>
+      <w:r>
+        <w:t>(</w:t>
+      </w:r>
+      <w:proofErr w:type="gramEnd"/>
+      <w:r>
+        <w:t xml:space="preserve">AWS, </w:t>
+      </w:r>
+      <w:proofErr w:type="spellStart"/>
+      <w:r>
+        <w:t>Gcp</w:t>
+      </w:r>
+      <w:proofErr w:type="spellEnd"/>
+      <w:r>
+        <w:t>, Azure)</w:t>
+      </w:r>
+    </w:p>
+    <w:p>
+      <w:pPr>
+        <w:pStyle w:val="Prrafodelista"/>
+        <w:numPr>
+          <w:ilvl w:val="1"/>
+          <w:numId w:val="7"/>
+        </w:numPr>
+      </w:pPr>
+      <w:r>
+        <w:t>Comunidades de código abierto</w:t>
+      </w:r>
+    </w:p>
+    <w:p>
+      <w:pPr>
+        <w:pStyle w:val="Prrafodelista"/>
+        <w:numPr>
+          <w:ilvl w:val="0"/>
+          <w:numId w:val="7"/>
+        </w:numPr>
+      </w:pPr>
+      <w:r>
+        <w:t>Estructura de Costos</w:t>
+      </w:r>
+    </w:p>
+    <w:p>
+      <w:pPr>
+        <w:pStyle w:val="Prrafodelista"/>
+        <w:numPr>
+          <w:ilvl w:val="1"/>
+          <w:numId w:val="7"/>
+        </w:numPr>
+      </w:pPr>
+      <w:r>
+        <w:t>Infraestructura en la nube (servidores, almacenamiento, certificados)</w:t>
+      </w:r>
+    </w:p>
+    <w:p>
+      <w:pPr>
+        <w:pStyle w:val="Prrafodelista"/>
+        <w:numPr>
+          <w:ilvl w:val="1"/>
+          <w:numId w:val="7"/>
+        </w:numPr>
+      </w:pPr>
+      <w:r>
+        <w:t>Seguridad y actualizaciones</w:t>
+      </w:r>
+    </w:p>
+    <w:p>
+      <w:pPr>
+        <w:pStyle w:val="Prrafodelista"/>
+        <w:numPr>
+          <w:ilvl w:val="1"/>
+          <w:numId w:val="7"/>
+        </w:numPr>
+      </w:pPr>
+      <w:r>
+        <w:t>Tiempo del equipo de desarrollo</w:t>
+      </w:r>
+    </w:p>
+    <w:p>
+      <w:pPr>
+        <w:pStyle w:val="Prrafodelista"/>
+        <w:numPr>
+          <w:ilvl w:val="1"/>
+          <w:numId w:val="7"/>
+        </w:numPr>
+      </w:pPr>
+      <w:r>
+        <w:t>Documentación y comunidad</w:t>
+      </w:r>
+    </w:p>
+    <w:p>
+      <w:pPr>
+        <w:pStyle w:val="Prrafodelista"/>
+        <w:numPr>
+          <w:ilvl w:val="1"/>
+          <w:numId w:val="7"/>
+        </w:numPr>
+      </w:pPr>
+      <w:r>
+        <w:t>Soporte técnico (si se ofrece como servicio)</w:t>
       </w:r>
     </w:p>
     <w:p/>
+    <w:p>
+      <w:pPr>
+        <w:rPr>
+          <w:b/>
+          <w:bCs/>
+        </w:rPr>
+      </w:pPr>
+    </w:p>
+    <w:p>
+      <w:pPr>
+        <w:rPr>
+          <w:b/>
+          <w:bCs/>
+        </w:rPr>
+      </w:pPr>
+      <w:r>
+        <w:rPr>
+          <w:b/>
+          <w:bCs/>
+        </w:rPr>
+        <w:lastRenderedPageBreak/>
+        <w:t>Esquema Financiero Simplificado</w:t>
+      </w:r>
+    </w:p>
+    <w:tbl>
+      <w:tblPr>
+        <w:tblW w:w="0" w:type="auto"/>
+        <w:tblLook w:val="04A0" w:firstRow="1" w:lastRow="0" w:firstColumn="1" w:lastColumn="0" w:noHBand="0" w:noVBand="1"/>
+      </w:tblPr>
+      <w:tblGrid>
+        <w:gridCol w:w="2868"/>
+        <w:gridCol w:w="2822"/>
+        <w:gridCol w:w="2814"/>
+      </w:tblGrid>
+      <w:tr>
+        <w:tc>
+          <w:tcPr>
+            <w:tcW w:w="2880" w:type="dxa"/>
+          </w:tcPr>
+          <w:p>
+            <w:r>
+              <w:t>Concepto</w:t>
+            </w:r>
+          </w:p>
+        </w:tc>
+        <w:tc>
+          <w:tcPr>
+            <w:tcW w:w="2880" w:type="dxa"/>
+          </w:tcPr>
+          <w:p>
+            <w:r>
+              <w:t>Costo mensual (€)</w:t>
+            </w:r>
+          </w:p>
+        </w:tc>
+        <w:tc>
+          <w:tcPr>
+            <w:tcW w:w="2880" w:type="dxa"/>
+          </w:tcPr>
+          <w:p>
+            <w:r>
+              <w:t>Costo anual (€)</w:t>
+            </w:r>
+          </w:p>
+        </w:tc>
+      </w:tr>
+      <w:tr>
+        <w:tc>
+          <w:tcPr>
+            <w:tcW w:w="2880" w:type="dxa"/>
+          </w:tcPr>
+          <w:p>
+            <w:r>
+              <w:t>Servidor en la nube (VPS/Cloud básico)</w:t>
+            </w:r>
+          </w:p>
+        </w:tc>
+        <w:tc>
+          <w:tcPr>
+            <w:tcW w:w="2880" w:type="dxa"/>
+          </w:tcPr>
+          <w:p>
+            <w:r>
+              <w:t>40</w:t>
+            </w:r>
+          </w:p>
+        </w:tc>
+        <w:tc>
+          <w:tcPr>
+            <w:tcW w:w="2880" w:type="dxa"/>
+          </w:tcPr>
+          <w:p>
+            <w:r>
+              <w:t>480</w:t>
+            </w:r>
+          </w:p>
+        </w:tc>
+      </w:tr>
+      <w:tr>
+        <w:tc>
+          <w:tcPr>
+            <w:tcW w:w="2880" w:type="dxa"/>
+          </w:tcPr>
+          <w:p>
+            <w:r>
+              <w:t>Certificados SSL/</w:t>
+            </w:r>
+            <w:proofErr w:type="spellStart"/>
+            <w:r>
+              <w:t>eID</w:t>
+            </w:r>
+            <w:proofErr w:type="spellEnd"/>
+            <w:r>
+              <w:t xml:space="preserve"> (si no hay gratuitos)</w:t>
+            </w:r>
+          </w:p>
+        </w:tc>
+        <w:tc>
+          <w:tcPr>
+            <w:tcW w:w="2880" w:type="dxa"/>
+          </w:tcPr>
+          <w:p>
+            <w:r>
+              <w:t>15</w:t>
+            </w:r>
+          </w:p>
+        </w:tc>
+        <w:tc>
+          <w:tcPr>
+            <w:tcW w:w="2880" w:type="dxa"/>
+          </w:tcPr>
+          <w:p>
+            <w:r>
+              <w:t>180</w:t>
+            </w:r>
+          </w:p>
+        </w:tc>
+      </w:tr>
+      <w:tr>
+        <w:tc>
+          <w:tcPr>
+            <w:tcW w:w="2880" w:type="dxa"/>
+          </w:tcPr>
+          <w:p>
+            <w:r>
+              <w:t xml:space="preserve">Almacenamiento y </w:t>
+            </w:r>
+            <w:proofErr w:type="spellStart"/>
+            <w:r>
+              <w:t>backups</w:t>
+            </w:r>
+            <w:proofErr w:type="spellEnd"/>
+          </w:p>
+        </w:tc>
+        <w:tc>
+          <w:tcPr>
+            <w:tcW w:w="2880" w:type="dxa"/>
+          </w:tcPr>
+          <w:p>
+            <w:r>
+              <w:t>20</w:t>
+            </w:r>
+          </w:p>
+        </w:tc>
+        <w:tc>
+          <w:tcPr>
+            <w:tcW w:w="2880" w:type="dxa"/>
+          </w:tcPr>
+          <w:p>
+            <w:r>
+              <w:t>240</w:t>
+            </w:r>
+          </w:p>
+        </w:tc>
+      </w:tr>
+      <w:tr>
+        <w:tc>
+          <w:tcPr>
+            <w:tcW w:w="2880" w:type="dxa"/>
+          </w:tcPr>
+          <w:p>
+            <w:r>
+              <w:t>Dominio</w:t>
+            </w:r>
+          </w:p>
+        </w:tc>
+        <w:tc>
+          <w:tcPr>
+            <w:tcW w:w="2880" w:type="dxa"/>
+          </w:tcPr>
+          <w:p>
+            <w:r>
+              <w:t>2</w:t>
+            </w:r>
+          </w:p>
+        </w:tc>
+        <w:tc>
+          <w:tcPr>
+            <w:tcW w:w="2880" w:type="dxa"/>
+          </w:tcPr>
+          <w:p>
+            <w:r>
+              <w:t>24</w:t>
+            </w:r>
+          </w:p>
+        </w:tc>
+      </w:tr>
+      <w:tr>
+        <w:tc>
+          <w:tcPr>
+            <w:tcW w:w="2880" w:type="dxa"/>
+          </w:tcPr>
+          <w:p>
+            <w:r>
+              <w:t>Soporte/mantenimiento mínimo (tiempo)</w:t>
+            </w:r>
+          </w:p>
+        </w:tc>
+        <w:tc>
+          <w:tcPr>
+            <w:tcW w:w="2880" w:type="dxa"/>
+          </w:tcPr>
+          <w:p>
+            <w:r>
+              <w:t>100</w:t>
+            </w:r>
+          </w:p>
+        </w:tc>
+        <w:tc>
+          <w:tcPr>
+            <w:tcW w:w="2880" w:type="dxa"/>
+          </w:tcPr>
+          <w:p>
+            <w:r>
+              <w:t>1200</w:t>
+            </w:r>
+          </w:p>
+        </w:tc>
+      </w:tr>
+      <w:tr>
+        <w:tc>
+          <w:tcPr>
+            <w:tcW w:w="2880" w:type="dxa"/>
+          </w:tcPr>
+          <w:p>
+            <w:r>
+              <w:t>TOTAL</w:t>
+            </w:r>
+          </w:p>
+        </w:tc>
+        <w:tc>
+          <w:tcPr>
+            <w:tcW w:w="2880" w:type="dxa"/>
+          </w:tcPr>
+          <w:p>
+            <w:r>
+              <w:t>177</w:t>
+            </w:r>
+          </w:p>
+        </w:tc>
+        <w:tc>
+          <w:tcPr>
+            <w:tcW w:w="2880" w:type="dxa"/>
+          </w:tcPr>
+          <w:p>
+            <w:r>
+              <w:t>2124</w:t>
+            </w:r>
+          </w:p>
+        </w:tc>
+      </w:tr>
+    </w:tbl>
+    <w:p>
+      <w:pPr>
+        <w:rPr>
+          <w:b/>
+          <w:bCs/>
+        </w:rPr>
+      </w:pPr>
+    </w:p>
     <w:p>
       <w:pPr>
         <w:rPr>
@@ -3610,15 +4530,7 @@
     </w:p>
     <w:p>
       <w:r>
-        <w:t xml:space="preserve">Una vez accedido a la aplicación en la pantalla de bienvenida, se mostrará un resumen de la situación del usuario, los censos en los que está inscrito, sus incidencias pendientes, las votaciones en las que está inscrito el usuario, noticias asociadas a las votaciones en las que este inscrito y si esta seleccionado o no para alguna Mesa Electoral. Toda esta visión rápida es fácil de manejar a través del menú en la parte superior de la ventana, en la cual se pueden ir configurando los diferentes aspectos de la aplicación. </w:t>
-      </w:r>
-      <w:proofErr w:type="spellStart"/>
-      <w:r>
-        <w:t>Tambien</w:t>
-      </w:r>
-      <w:proofErr w:type="spellEnd"/>
-      <w:r>
-        <w:t xml:space="preserve"> tendrá una pequeña bienvenida con un resumen de varios datos personales a modo de bienvenida.</w:t>
+        <w:t>Una vez accedido a la aplicación en la pantalla de bienvenida, se mostrará un resumen de la situación del usuario, los censos en los que está inscrito, sus incidencias pendientes, las votaciones en las que está inscrito el usuario, noticias asociadas a las votaciones en las que este inscrito y si esta seleccionado o no para alguna Mesa Electoral. Toda esta visión rápida es fácil de manejar a través del menú en la parte superior de la ventana, en la cual se pueden ir configurando los diferentes aspectos de la aplicación. Tambien tendrá una pequeña bienvenida con un resumen de varios datos personales a modo de bienvenida.</w:t>
       </w:r>
     </w:p>
     <w:p>
@@ -3660,15 +4572,7 @@
     </w:p>
     <w:p>
       <w:r>
-        <w:t xml:space="preserve">En la parte a la derecha de donde se muestran las distintas votaciones hay 3 botones, uno de ellos nos permite acceder a la votación en si misma para emitir el voto, con el otro podemos mostrar las estadísticas de la votación, serán diferentes estadísticas en función de si la votación está o no activa. Por último, </w:t>
-      </w:r>
-      <w:proofErr w:type="spellStart"/>
-      <w:r>
-        <w:t>habra</w:t>
-      </w:r>
-      <w:proofErr w:type="spellEnd"/>
-      <w:r>
-        <w:t xml:space="preserve"> también la posibilidad de generar una incidencia sobre las votaciones, por el tema que sea, pero asociadas a las votaciones (las incidencias típicas es que no se pueda acceder a la votación, que no deja emitir el voto…)</w:t>
+        <w:t>En la parte a la derecha de donde se muestran las distintas votaciones hay 3 botones, uno de ellos nos permite acceder a la votación en si misma para emitir el voto, con el otro podemos mostrar las estadísticas de la votación, serán diferentes estadísticas en función de si la votación está o no activa. Por último, habra también la posibilidad de generar una incidencia sobre las votaciones, por el tema que sea, pero asociadas a las votaciones (las incidencias típicas es que no se pueda acceder a la votación, que no deja emitir el voto…)</w:t>
       </w:r>
     </w:p>
     <w:p/>
@@ -3763,15 +4667,7 @@
     </w:p>
     <w:p>
       <w:r>
-        <w:t xml:space="preserve">En el menú de la parte superior si el usuario es administrador (o </w:t>
-      </w:r>
-      <w:proofErr w:type="spellStart"/>
-      <w:r>
-        <w:t>superuser</w:t>
-      </w:r>
-      <w:proofErr w:type="spellEnd"/>
-      <w:r>
-        <w:t xml:space="preserve"> como se considera por Django) se habilita una nueva pestaña que nos lleva a la parte de administración de la APP. </w:t>
+        <w:t xml:space="preserve">En el menú de la parte superior si el usuario es administrador (o superuser como se considera por Django) se habilita una nueva pestaña que nos lleva a la parte de administración de la APP. </w:t>
       </w:r>
     </w:p>
     <w:p>
@@ -3801,15 +4697,7 @@
         <w:t xml:space="preserve">Gestión de Incidencias: </w:t>
       </w:r>
       <w:r>
-        <w:t xml:space="preserve"> Las distintas incidencias que pueden registrarse por los usuarios en las distintas partes de la APP se mostrarán aquí para los usuarios administradores, que serán los encargados de revisarlas y solucionarlas. Una vez los administradores hayan </w:t>
-      </w:r>
-      <w:proofErr w:type="spellStart"/>
-      <w:r>
-        <w:t>recepcionado</w:t>
-      </w:r>
-      <w:proofErr w:type="spellEnd"/>
-      <w:r>
-        <w:t xml:space="preserve"> y procesado la incidencia pueden cerrarla o dejarla abierta, dando un </w:t>
+        <w:t xml:space="preserve"> Las distintas incidencias que pueden registrarse por los usuarios en las distintas partes de la APP se mostrarán aquí para los usuarios administradores, que serán los encargados de revisarlas y solucionarlas. Una vez los administradores hayan recepcionado y procesado la incidencia pueden cerrarla o dejarla abierta, dando un </w:t>
       </w:r>
       <w:proofErr w:type="spellStart"/>
       <w:r>
@@ -3892,15 +4780,7 @@
         <w:t xml:space="preserve">Manejar Votaciones: </w:t>
       </w:r>
       <w:r>
-        <w:t xml:space="preserve">Las distintas votaciones aparecerán en forma de tabla para poder seleccionar la votación de la cual queremos hacer alguna gestión, podemos asignar los censos a las votaciones, asignar los usuarios y/o crearlos en caso de necesidad, desde aquí </w:t>
-      </w:r>
-      <w:proofErr w:type="spellStart"/>
-      <w:r>
-        <w:t>tambien</w:t>
-      </w:r>
-      <w:proofErr w:type="spellEnd"/>
-      <w:r>
-        <w:t xml:space="preserve"> asignamos las candidaturas posteriormente a los pasos anteriores y aquí también se puede sortear las mesas electorales. Este sorteo se realizará excluyendo a los pertenecientes a las candidaturas asociadas a esa votación, y con un representante en la mesa por cada 25 inscritos en el censo. También desde aquí se podrá notificar a los usuarios que puedan ejercer su derecho a voto su inscripción en la votación por correo. No obstante, en la APP siempre estará visible para los usuarios en que votaciones están o no inscritos.</w:t>
+        <w:t>Las distintas votaciones aparecerán en forma de tabla para poder seleccionar la votación de la cual queremos hacer alguna gestión, podemos asignar los censos a las votaciones, asignar los usuarios y/o crearlos en caso de necesidad, desde aquí tambien asignamos las candidaturas posteriormente a los pasos anteriores y aquí también se puede sortear las mesas electorales. Este sorteo se realizará excluyendo a los pertenecientes a las candidaturas asociadas a esa votación, y con un representante en la mesa por cada 25 inscritos en el censo. También desde aquí se podrá notificar a los usuarios que puedan ejercer su derecho a voto su inscripción en la votación por correo. No obstante, en la APP siempre estará visible para los usuarios en que votaciones están o no inscritos.</w:t>
       </w:r>
     </w:p>
     <w:p>
@@ -3932,6 +4812,155 @@
     </w:sectPr>
   </w:body>
 </w:document>
+</file>
+
+<file path=word/endnotes.xml><?xml version="1.0" encoding="utf-8"?>
+<w:endnotes xmlns:wpc="http://schemas.microsoft.com/office/word/2010/wordprocessingCanvas" xmlns:cx="http://schemas.microsoft.com/office/drawing/2014/chartex" xmlns:cx1="http://schemas.microsoft.com/office/drawing/2015/9/8/chartex" xmlns:cx2="http://schemas.microsoft.com/office/drawing/2015/10/21/chartex" xmlns:cx3="http://schemas.microsoft.com/office/drawing/2016/5/9/chartex" xmlns:cx4="http://schemas.microsoft.com/office/drawing/2016/5/10/chartex" xmlns:cx5="http://schemas.microsoft.com/office/drawing/2016/5/11/chartex" xmlns:cx6="http://schemas.microsoft.com/office/drawing/2016/5/12/chartex" xmlns:cx7="http://schemas.microsoft.com/office/drawing/2016/5/13/chartex" xmlns:cx8="http://schemas.microsoft.com/office/drawing/2016/5/14/chartex" xmlns:mc="http://schemas.openxmlformats.org/markup-compatibility/2006" xmlns:aink="http://schemas.microsoft.com/office/drawing/2016/ink" xmlns:am3d="http://schemas.microsoft.com/office/drawing/2017/model3d" xmlns:o="urn:schemas-microsoft-com:office:office" xmlns:oel="http://schemas.microsoft.com/office/2019/extlst" xmlns:r="http://schemas.openxmlformats.org/officeDocument/2006/relationships" xmlns:m="http://schemas.openxmlformats.org/officeDocument/2006/math" xmlns:v="urn:schemas-microsoft-com:vml" xmlns:wp14="http://schemas.microsoft.com/office/word/2010/wordprocessingDrawing" xmlns:wp="http://schemas.openxmlformats.org/drawingml/2006/wordprocessingDrawing" xmlns:w10="urn:schemas-microsoft-com:office:word" xmlns:w="http://schemas.openxmlformats.org/wordprocessingml/2006/main" xmlns:w14="http://schemas.microsoft.com/office/word/2010/wordml" xmlns:w15="http://schemas.microsoft.com/office/word/2012/wordml" xmlns:w16cex="http://schemas.microsoft.com/office/word/2018/wordml/cex" xmlns:w16cid="http://schemas.microsoft.com/office/word/2016/wordml/cid" xmlns:w16="http://schemas.microsoft.com/office/word/2018/wordml" xmlns:w16du="http://schemas.microsoft.com/office/word/2023/wordml/word16du" xmlns:w16sdtdh="http://schemas.microsoft.com/office/word/2020/wordml/sdtdatahash" xmlns:w16sdtfl="http://schemas.microsoft.com/office/word/2024/wordml/sdtformatlock" xmlns:w16se="http://schemas.microsoft.com/office/word/2015/wordml/symex" xmlns:wpg="http://schemas.microsoft.com/office/word/2010/wordprocessingGroup" xmlns:wpi="http://schemas.microsoft.com/office/word/2010/wordprocessingInk" xmlns:wne="http://schemas.microsoft.com/office/word/2006/wordml" xmlns:wps="http://schemas.microsoft.com/office/word/2010/wordprocessingShape" mc:Ignorable="w14 w15 w16se w16cid w16 w16cex w16sdtdh w16sdtfl w16du wp14">
+  <w:endnote w:type="separator" w:id="-1">
+    <w:p>
+      <w:pPr>
+        <w:spacing w:after="0" w:line="240" w:lineRule="auto"/>
+      </w:pPr>
+      <w:r>
+        <w:separator/>
+      </w:r>
+    </w:p>
+  </w:endnote>
+  <w:endnote w:type="continuationSeparator" w:id="0">
+    <w:p>
+      <w:pPr>
+        <w:spacing w:after="0" w:line="240" w:lineRule="auto"/>
+      </w:pPr>
+      <w:r>
+        <w:continuationSeparator/>
+      </w:r>
+    </w:p>
+  </w:endnote>
+</w:endnotes>
+</file>
+
+<file path=word/footnotes.xml><?xml version="1.0" encoding="utf-8"?>
+<w:footnotes xmlns:wpc="http://schemas.microsoft.com/office/word/2010/wordprocessingCanvas" xmlns:cx="http://schemas.microsoft.com/office/drawing/2014/chartex" xmlns:cx1="http://schemas.microsoft.com/office/drawing/2015/9/8/chartex" xmlns:cx2="http://schemas.microsoft.com/office/drawing/2015/10/21/chartex" xmlns:cx3="http://schemas.microsoft.com/office/drawing/2016/5/9/chartex" xmlns:cx4="http://schemas.microsoft.com/office/drawing/2016/5/10/chartex" xmlns:cx5="http://schemas.microsoft.com/office/drawing/2016/5/11/chartex" xmlns:cx6="http://schemas.microsoft.com/office/drawing/2016/5/12/chartex" xmlns:cx7="http://schemas.microsoft.com/office/drawing/2016/5/13/chartex" xmlns:cx8="http://schemas.microsoft.com/office/drawing/2016/5/14/chartex" xmlns:mc="http://schemas.openxmlformats.org/markup-compatibility/2006" xmlns:aink="http://schemas.microsoft.com/office/drawing/2016/ink" xmlns:am3d="http://schemas.microsoft.com/office/drawing/2017/model3d" xmlns:o="urn:schemas-microsoft-com:office:office" xmlns:oel="http://schemas.microsoft.com/office/2019/extlst" xmlns:r="http://schemas.openxmlformats.org/officeDocument/2006/relationships" xmlns:m="http://schemas.openxmlformats.org/officeDocument/2006/math" xmlns:v="urn:schemas-microsoft-com:vml" xmlns:wp14="http://schemas.microsoft.com/office/word/2010/wordprocessingDrawing" xmlns:wp="http://schemas.openxmlformats.org/drawingml/2006/wordprocessingDrawing" xmlns:w10="urn:schemas-microsoft-com:office:word" xmlns:w="http://schemas.openxmlformats.org/wordprocessingml/2006/main" xmlns:w14="http://schemas.microsoft.com/office/word/2010/wordml" xmlns:w15="http://schemas.microsoft.com/office/word/2012/wordml" xmlns:w16cex="http://schemas.microsoft.com/office/word/2018/wordml/cex" xmlns:w16cid="http://schemas.microsoft.com/office/word/2016/wordml/cid" xmlns:w16="http://schemas.microsoft.com/office/word/2018/wordml" xmlns:w16du="http://schemas.microsoft.com/office/word/2023/wordml/word16du" xmlns:w16sdtdh="http://schemas.microsoft.com/office/word/2020/wordml/sdtdatahash" xmlns:w16sdtfl="http://schemas.microsoft.com/office/word/2024/wordml/sdtformatlock" xmlns:w16se="http://schemas.microsoft.com/office/word/2015/wordml/symex" xmlns:wpg="http://schemas.microsoft.com/office/word/2010/wordprocessingGroup" xmlns:wpi="http://schemas.microsoft.com/office/word/2010/wordprocessingInk" xmlns:wne="http://schemas.microsoft.com/office/word/2006/wordml" xmlns:wps="http://schemas.microsoft.com/office/word/2010/wordprocessingShape" mc:Ignorable="w14 w15 w16se w16cid w16 w16cex w16sdtdh w16sdtfl w16du wp14">
+  <w:footnote w:type="separator" w:id="-1">
+    <w:p>
+      <w:pPr>
+        <w:spacing w:after="0" w:line="240" w:lineRule="auto"/>
+      </w:pPr>
+      <w:r>
+        <w:separator/>
+      </w:r>
+    </w:p>
+  </w:footnote>
+  <w:footnote w:type="continuationSeparator" w:id="0">
+    <w:p>
+      <w:pPr>
+        <w:spacing w:after="0" w:line="240" w:lineRule="auto"/>
+      </w:pPr>
+      <w:r>
+        <w:continuationSeparator/>
+      </w:r>
+    </w:p>
+  </w:footnote>
+  <w:footnote w:id="1">
+    <w:p>
+      <w:pPr>
+        <w:pStyle w:val="Textonotapie"/>
+      </w:pPr>
+      <w:r>
+        <w:rPr>
+          <w:rStyle w:val="Refdenotaalpie"/>
+        </w:rPr>
+        <w:footnoteRef/>
+      </w:r>
+      <w:r>
+        <w:t xml:space="preserve"> </w:t>
+      </w:r>
+      <w:r>
+        <w:t xml:space="preserve">Osterwalder &amp; Pigneur — </w:t>
+      </w:r>
+      <w:r>
+        <w:rPr>
+          <w:i/>
+          <w:iCs/>
+        </w:rPr>
+        <w:t xml:space="preserve">Business Model </w:t>
+      </w:r>
+      <w:proofErr w:type="spellStart"/>
+      <w:r>
+        <w:rPr>
+          <w:i/>
+          <w:iCs/>
+        </w:rPr>
+        <w:t>Generation</w:t>
+      </w:r>
+      <w:proofErr w:type="spellEnd"/>
+    </w:p>
+  </w:footnote>
+  <w:footnote w:id="2">
+    <w:p>
+      <w:pPr>
+        <w:pStyle w:val="Textonotapie"/>
+      </w:pPr>
+      <w:r>
+        <w:rPr>
+          <w:rStyle w:val="Refdenotaalpie"/>
+        </w:rPr>
+        <w:footnoteRef/>
+      </w:r>
+      <w:r>
+        <w:t xml:space="preserve"> </w:t>
+      </w:r>
+      <w:proofErr w:type="spellStart"/>
+      <w:r>
+        <w:t>Clarifying</w:t>
+      </w:r>
+      <w:proofErr w:type="spellEnd"/>
+      <w:r>
+        <w:t xml:space="preserve"> Business </w:t>
+      </w:r>
+      <w:proofErr w:type="spellStart"/>
+      <w:r>
+        <w:t>Models</w:t>
+      </w:r>
+      <w:proofErr w:type="spellEnd"/>
+      <w:r>
+        <w:t xml:space="preserve">: </w:t>
+      </w:r>
+      <w:proofErr w:type="spellStart"/>
+      <w:r>
+        <w:t>Origins</w:t>
+      </w:r>
+      <w:proofErr w:type="spellEnd"/>
+      <w:r>
+        <w:t xml:space="preserve">, </w:t>
+      </w:r>
+      <w:proofErr w:type="spellStart"/>
+      <w:r>
+        <w:t>Present</w:t>
+      </w:r>
+      <w:proofErr w:type="spellEnd"/>
+      <w:r>
+        <w:t xml:space="preserve">, and Future </w:t>
+      </w:r>
+      <w:proofErr w:type="spellStart"/>
+      <w:r>
+        <w:t>of</w:t>
+      </w:r>
+      <w:proofErr w:type="spellEnd"/>
+      <w:r>
+        <w:t xml:space="preserve"> </w:t>
+      </w:r>
+      <w:proofErr w:type="spellStart"/>
+      <w:r>
+        <w:t>the</w:t>
+      </w:r>
+      <w:proofErr w:type="spellEnd"/>
+      <w:r>
+        <w:t xml:space="preserve"> Concept” (Osterwalder, Pigneur, Tucci, 2005)</w:t>
+      </w:r>
+    </w:p>
+  </w:footnote>
+</w:footnotes>
 </file>
 
 <file path=word/numbering.xml><?xml version="1.0" encoding="utf-8"?>
@@ -4642,6 +5671,95 @@
     </w:lvl>
   </w:abstractNum>
   <w:abstractNum w:abstractNumId="5" w15:restartNumberingAfterBreak="0">
+    <w:nsid w:val="6E6C76F3"/>
+    <w:multiLevelType w:val="hybridMultilevel"/>
+    <w:tmpl w:val="08C0FFB0"/>
+    <w:lvl w:ilvl="0" w:tplc="D81058DA">
+      <w:start w:val="1"/>
+      <w:numFmt w:val="decimal"/>
+      <w:lvlText w:val="%1-"/>
+      <w:lvlJc w:val="left"/>
+      <w:pPr>
+        <w:ind w:left="720" w:hanging="360"/>
+      </w:pPr>
+      <w:rPr>
+        <w:rFonts w:hint="default"/>
+      </w:rPr>
+    </w:lvl>
+    <w:lvl w:ilvl="1" w:tplc="0C0A0019">
+      <w:start w:val="1"/>
+      <w:numFmt w:val="lowerLetter"/>
+      <w:lvlText w:val="%2."/>
+      <w:lvlJc w:val="left"/>
+      <w:pPr>
+        <w:ind w:left="1440" w:hanging="360"/>
+      </w:pPr>
+    </w:lvl>
+    <w:lvl w:ilvl="2" w:tplc="0C0A001B" w:tentative="1">
+      <w:start w:val="1"/>
+      <w:numFmt w:val="lowerRoman"/>
+      <w:lvlText w:val="%3."/>
+      <w:lvlJc w:val="right"/>
+      <w:pPr>
+        <w:ind w:left="2160" w:hanging="180"/>
+      </w:pPr>
+    </w:lvl>
+    <w:lvl w:ilvl="3" w:tplc="0C0A000F" w:tentative="1">
+      <w:start w:val="1"/>
+      <w:numFmt w:val="decimal"/>
+      <w:lvlText w:val="%4."/>
+      <w:lvlJc w:val="left"/>
+      <w:pPr>
+        <w:ind w:left="2880" w:hanging="360"/>
+      </w:pPr>
+    </w:lvl>
+    <w:lvl w:ilvl="4" w:tplc="0C0A0019" w:tentative="1">
+      <w:start w:val="1"/>
+      <w:numFmt w:val="lowerLetter"/>
+      <w:lvlText w:val="%5."/>
+      <w:lvlJc w:val="left"/>
+      <w:pPr>
+        <w:ind w:left="3600" w:hanging="360"/>
+      </w:pPr>
+    </w:lvl>
+    <w:lvl w:ilvl="5" w:tplc="0C0A001B" w:tentative="1">
+      <w:start w:val="1"/>
+      <w:numFmt w:val="lowerRoman"/>
+      <w:lvlText w:val="%6."/>
+      <w:lvlJc w:val="right"/>
+      <w:pPr>
+        <w:ind w:left="4320" w:hanging="180"/>
+      </w:pPr>
+    </w:lvl>
+    <w:lvl w:ilvl="6" w:tplc="0C0A000F" w:tentative="1">
+      <w:start w:val="1"/>
+      <w:numFmt w:val="decimal"/>
+      <w:lvlText w:val="%7."/>
+      <w:lvlJc w:val="left"/>
+      <w:pPr>
+        <w:ind w:left="5040" w:hanging="360"/>
+      </w:pPr>
+    </w:lvl>
+    <w:lvl w:ilvl="7" w:tplc="0C0A0019" w:tentative="1">
+      <w:start w:val="1"/>
+      <w:numFmt w:val="lowerLetter"/>
+      <w:lvlText w:val="%8."/>
+      <w:lvlJc w:val="left"/>
+      <w:pPr>
+        <w:ind w:left="5760" w:hanging="360"/>
+      </w:pPr>
+    </w:lvl>
+    <w:lvl w:ilvl="8" w:tplc="0C0A001B" w:tentative="1">
+      <w:start w:val="1"/>
+      <w:numFmt w:val="lowerRoman"/>
+      <w:lvlText w:val="%9."/>
+      <w:lvlJc w:val="right"/>
+      <w:pPr>
+        <w:ind w:left="6480" w:hanging="180"/>
+      </w:pPr>
+    </w:lvl>
+  </w:abstractNum>
+  <w:abstractNum w:abstractNumId="6" w15:restartNumberingAfterBreak="0">
     <w:nsid w:val="6E8D590B"/>
     <w:multiLevelType w:val="hybridMultilevel"/>
     <w:tmpl w:val="27F69186"/>
@@ -4769,6 +5887,9 @@
     <w:abstractNumId w:val="4"/>
   </w:num>
   <w:num w:numId="6" w16cid:durableId="1966889322">
+    <w:abstractNumId w:val="6"/>
+  </w:num>
+  <w:num w:numId="7" w16cid:durableId="220757042">
     <w:abstractNumId w:val="5"/>
   </w:num>
 </w:numbering>
@@ -5375,7 +6496,6 @@
   <w:style w:type="character" w:default="1" w:styleId="Fuentedeprrafopredeter">
     <w:name w:val="Default Paragraph Font"/>
     <w:uiPriority w:val="1"/>
-    <w:semiHidden/>
     <w:unhideWhenUsed/>
   </w:style>
   <w:style w:type="table" w:default="1" w:styleId="Tablanormal">
@@ -5786,6 +6906,45 @@
       <w:u w:val="single"/>
     </w:rPr>
   </w:style>
+  <w:style w:type="paragraph" w:styleId="Textonotapie">
+    <w:name w:val="footnote text"/>
+    <w:basedOn w:val="Normal"/>
+    <w:link w:val="TextonotapieCar"/>
+    <w:uiPriority w:val="99"/>
+    <w:semiHidden/>
+    <w:unhideWhenUsed/>
+    <w:rsid w:val="006506A1"/>
+    <w:pPr>
+      <w:spacing w:after="0" w:line="240" w:lineRule="auto"/>
+    </w:pPr>
+    <w:rPr>
+      <w:sz w:val="20"/>
+      <w:szCs w:val="20"/>
+    </w:rPr>
+  </w:style>
+  <w:style w:type="character" w:customStyle="1" w:styleId="TextonotapieCar">
+    <w:name w:val="Texto nota pie Car"/>
+    <w:basedOn w:val="Fuentedeprrafopredeter"/>
+    <w:link w:val="Textonotapie"/>
+    <w:uiPriority w:val="99"/>
+    <w:semiHidden/>
+    <w:rsid w:val="006506A1"/>
+    <w:rPr>
+      <w:sz w:val="20"/>
+      <w:szCs w:val="20"/>
+    </w:rPr>
+  </w:style>
+  <w:style w:type="character" w:styleId="Refdenotaalpie">
+    <w:name w:val="footnote reference"/>
+    <w:basedOn w:val="Fuentedeprrafopredeter"/>
+    <w:uiPriority w:val="99"/>
+    <w:semiHidden/>
+    <w:unhideWhenUsed/>
+    <w:rsid w:val="006506A1"/>
+    <w:rPr>
+      <w:vertAlign w:val="superscript"/>
+    </w:rPr>
+  </w:style>
 </w:styles>
 </file>
 

</xml_diff>

<commit_message>
Actualización del TFG y anexos para reflejar cambios en el recuento
- Actualización de los anexos de diseño para reflejar los cambios en el proceso de recuento de la aplicación.
- Ajustes en las conclusiones del documento.
- Modificaciones menores en el apartado de aspectos relevantes del proyecto para mantener la coherencia con la implementación actual.
-Modificación de los diagramas asociados para la explicación visual.

Closes #33
</commit_message>
<xml_diff>
--- a/DocumentosTFG/Anexos TFG.docx
+++ b/DocumentosTFG/Anexos TFG.docx
@@ -14,7 +14,7 @@
           <w:shd w:val="clear" w:color="auto" w:fill="FFFFFF"/>
         </w:rPr>
         <w:drawing>
-          <wp:inline distT="0" distB="0" distL="0" distR="0" wp14:anchorId="6CBCFA8F" wp14:editId="62A16BF1">
+          <wp:inline distT="0" distB="0" distL="0" distR="0" wp14:anchorId="6CBCFA8F" wp14:editId="71D667D4">
             <wp:extent cx="5400040" cy="1184275"/>
             <wp:effectExtent l="0" t="0" r="0" b="0"/>
             <wp:docPr id="1764844086" name="Imagen 1" descr="Interfaz de usuario gráfica, Texto&#10;&#10;Descripción generada automáticamente con confianza media"/>
@@ -7551,7 +7551,11 @@
       </w:r>
       <w:proofErr w:type="spellEnd"/>
       <w:r>
-        <w:t xml:space="preserve"> directamente relacionada con la planificación por iteraciones y con las restricciones ya comentadas previamente, sirviendo el gráfico como apoyo visual de la planificación temporal descrita. </w:t>
+        <w:t xml:space="preserve"> directamente relacionada con la planificación por </w:t>
+      </w:r>
+      <w:r>
+        <w:lastRenderedPageBreak/>
+        <w:t xml:space="preserve">iteraciones y con las restricciones ya comentadas previamente, sirviendo el gráfico como apoyo visual de la planificación temporal descrita. </w:t>
       </w:r>
     </w:p>
     <w:p>
@@ -7560,7 +7564,6 @@
       </w:pPr>
       <w:bookmarkStart w:id="9" w:name="_Toc220284152"/>
       <w:r>
-        <w:lastRenderedPageBreak/>
         <w:t>A.3. Estudio de viabilidad</w:t>
       </w:r>
       <w:bookmarkEnd w:id="9"/>
@@ -7754,6 +7757,7 @@
         </w:numPr>
       </w:pPr>
       <w:r>
+        <w:lastRenderedPageBreak/>
         <w:t>Plataforma segura y transparente para realizar votaciones telemáticas mediante certificados electrónicos de CA o autofirmados, elegibles en función del tipo de votación.</w:t>
       </w:r>
     </w:p>
@@ -7766,7 +7770,6 @@
         </w:numPr>
       </w:pPr>
       <w:r>
-        <w:lastRenderedPageBreak/>
         <w:t>Código abierto y gratuito</w:t>
       </w:r>
       <w:r>
@@ -8368,7 +8371,6 @@
           <w:b/>
           <w:bCs/>
         </w:rPr>
-        <w:lastRenderedPageBreak/>
         <w:t>Esquema Financiero Simplificado</w:t>
       </w:r>
     </w:p>
@@ -8737,28 +8739,12 @@
     </w:p>
     <w:p>
       <w:r>
-        <w:t xml:space="preserve">Este apéndice contiene la definición de los requisitos de la APP </w:t>
-      </w:r>
-      <w:proofErr w:type="spellStart"/>
-      <w:r>
-        <w:t>TeleVot</w:t>
-      </w:r>
-      <w:proofErr w:type="spellEnd"/>
-      <w:r>
-        <w:t>. Se apoya en los diagramas de casos de uso y sus plantillas para definir requisitos verificables. El documento servirá como base para diseño, implementación y pruebas de aceptación.</w:t>
-      </w:r>
-    </w:p>
-    <w:p>
-      <w:r>
-        <w:t xml:space="preserve">El sistema permitirá a los usuarios regulares realizar una votación mediante certificados electrónicos que verifiquen su identidad dentro de la APP </w:t>
-      </w:r>
-      <w:proofErr w:type="spellStart"/>
-      <w:r>
-        <w:t>TeleVot</w:t>
-      </w:r>
-      <w:proofErr w:type="spellEnd"/>
-      <w:r>
-        <w:t>.</w:t>
+        <w:t>Este apéndice contiene la definición de los requisitos de la APP TeleVot. Se apoya en los diagramas de casos de uso y sus plantillas para definir requisitos verificables. El documento servirá como base para diseño, implementación y pruebas de aceptación.</w:t>
+      </w:r>
+    </w:p>
+    <w:p>
+      <w:r>
+        <w:t>El sistema permitirá a los usuarios regulares realizar una votación mediante certificados electrónicos que verifiquen su identidad dentro de la APP TeleVot.</w:t>
       </w:r>
     </w:p>
     <w:p>
@@ -18537,7 +18523,11 @@
           </w:tcPr>
           <w:p>
             <w:r>
-              <w:t>El sistema debe permitir crear, publicar y eliminar noticias.</w:t>
+              <w:t xml:space="preserve">El sistema debe permitir crear, </w:t>
+            </w:r>
+            <w:r>
+              <w:lastRenderedPageBreak/>
+              <w:t>publicar y eliminar noticias.</w:t>
             </w:r>
           </w:p>
         </w:tc>
@@ -18549,6 +18539,7 @@
           </w:tcPr>
           <w:p>
             <w:r>
+              <w:lastRenderedPageBreak/>
               <w:t>Junta/Mesa Electoral</w:t>
             </w:r>
           </w:p>
@@ -18602,7 +18593,6 @@
           </w:tcPr>
           <w:p>
             <w:r>
-              <w:lastRenderedPageBreak/>
               <w:t>RF-009</w:t>
             </w:r>
           </w:p>
@@ -22404,19 +22394,25 @@
         <w:t>La persistencia de los datos se realiza sobre la base de datos relacional PostgreSQL, accedida a través del ORM de Django</w:t>
       </w:r>
       <w:r>
-        <w:t xml:space="preserve">. El uso de ORM permite definir las relaciones entre entidades, aplicar restricciones de integridad y facilitar los cambios en los esquemas de </w:t>
+        <w:t xml:space="preserve">. El uso de ORM permite definir las relaciones entre </w:t>
       </w:r>
       <w:r>
         <w:lastRenderedPageBreak/>
-        <w:t xml:space="preserve">datos ya que es muy sencillo mediante los comandos </w:t>
+        <w:t xml:space="preserve">entidades, aplicar restricciones de integridad y facilitar los cambios en los esquemas de datos ya que es muy sencillo mediante los comandos </w:t>
       </w:r>
       <w:proofErr w:type="spellStart"/>
       <w:r>
-        <w:t>migration</w:t>
+        <w:t>migrat</w:t>
+      </w:r>
+      <w:r>
+        <w:t>e</w:t>
       </w:r>
       <w:proofErr w:type="spellEnd"/>
       <w:r>
-        <w:t xml:space="preserve"> y </w:t>
+        <w:t xml:space="preserve"> </w:t>
+      </w:r>
+      <w:r>
+        <w:t xml:space="preserve">y </w:t>
       </w:r>
       <w:proofErr w:type="spellStart"/>
       <w:r>
@@ -22424,11 +22420,26 @@
       </w:r>
       <w:proofErr w:type="spellEnd"/>
       <w:r>
-        <w:t xml:space="preserve"> realizar las modificaciones y que estas se reflejen en la Base de datos. Opcionalmente y con el único fin de que se puedan realizar demos se proporciona la opción de </w:t>
+        <w:t xml:space="preserve"> realizar las modificaciones y que estas se reflejen en la Base de datos.</w:t>
+      </w:r>
+    </w:p>
+    <w:p>
+      <w:r>
+        <w:t>Además de las entidades básicas del proceso electoral, el sistema incorpora un modelo específico para la persistencia de los resultados del recuento. Una vez finalizado el proceso de votación y autorizado el recuento, el resultado final se almacena de forma agregada en la base de datos, separando claramente el cálculo del resultado de su posterior visualización. Para ello se persiste un resumen global del proceso electoral, que incluye datos como el número total de censados, votos emitidos, porcentaje de participación y candidatura ganadora, junto con un desglose del número de votos obtenido por cada candidatura.</w:t>
+      </w:r>
+    </w:p>
+    <w:p>
+      <w:r>
+        <w:t>Este enfoque permite que la consulta de resultados por parte de los distintos roles de usuario se realice exclusivamente en modo lectura sobre datos ya calculados, evitando recalcular el recuento y reforzando la integridad del proceso. En ningún caso se almacena información que permita reconstruir la relación entre un voto individual y el elector que lo emitió, manteniéndose el principio de anonimato incluso tras la finalización del proceso electoral.</w:t>
+      </w:r>
+    </w:p>
+    <w:p>
+      <w:r>
+        <w:t xml:space="preserve"> Opcionalmente y con el único fin de que se puedan realizar demos se proporciona la opción de </w:t>
       </w:r>
       <w:proofErr w:type="spellStart"/>
       <w:r>
-        <w:t>DBSqlite</w:t>
+        <w:t>Sqlite</w:t>
       </w:r>
       <w:proofErr w:type="spellEnd"/>
       <w:r>
@@ -22491,10 +22502,10 @@
           <w:noProof/>
         </w:rPr>
         <w:drawing>
-          <wp:inline distT="0" distB="0" distL="0" distR="0" wp14:anchorId="037DFF27" wp14:editId="797F1BA7">
-            <wp:extent cx="5400040" cy="5129530"/>
+          <wp:inline distT="0" distB="0" distL="0" distR="0" wp14:anchorId="0C95EAE1" wp14:editId="565C530E">
+            <wp:extent cx="5400040" cy="5030470"/>
             <wp:effectExtent l="0" t="0" r="0" b="0"/>
-            <wp:docPr id="380179205" name="Gráfico 1"/>
+            <wp:docPr id="16164645" name="Gráfico 1"/>
             <wp:cNvGraphicFramePr>
               <a:graphicFrameLocks xmlns:a="http://schemas.openxmlformats.org/drawingml/2006/main" noChangeAspect="1"/>
             </wp:cNvGraphicFramePr>
@@ -22502,7 +22513,7 @@
               <a:graphicData uri="http://schemas.openxmlformats.org/drawingml/2006/picture">
                 <pic:pic xmlns:pic="http://schemas.openxmlformats.org/drawingml/2006/picture">
                   <pic:nvPicPr>
-                    <pic:cNvPr id="380179205" name=""/>
+                    <pic:cNvPr id="16164645" name="Gráfico 16164645"/>
                     <pic:cNvPicPr/>
                   </pic:nvPicPr>
                   <pic:blipFill>
@@ -22520,7 +22531,7 @@
                   <pic:spPr>
                     <a:xfrm>
                       <a:off x="0" y="0"/>
-                      <a:ext cx="5400040" cy="5129530"/>
+                      <a:ext cx="5400040" cy="5030470"/>
                     </a:xfrm>
                     <a:prstGeom prst="rect">
                       <a:avLst/>
@@ -22576,10 +22587,10 @@
           <w:noProof/>
         </w:rPr>
         <w:drawing>
-          <wp:inline distT="0" distB="0" distL="0" distR="0" wp14:anchorId="03F4A916" wp14:editId="30B2BA42">
-            <wp:extent cx="5400040" cy="7468870"/>
+          <wp:inline distT="0" distB="0" distL="0" distR="0" wp14:anchorId="4776FA5B" wp14:editId="1B385AA9">
+            <wp:extent cx="6003925" cy="6210300"/>
             <wp:effectExtent l="0" t="0" r="0" b="0"/>
-            <wp:docPr id="1612775129" name="Gráfico 1"/>
+            <wp:docPr id="1319824235" name="Gráfico 2"/>
             <wp:cNvGraphicFramePr>
               <a:graphicFrameLocks xmlns:a="http://schemas.openxmlformats.org/drawingml/2006/main" noChangeAspect="1"/>
             </wp:cNvGraphicFramePr>
@@ -22587,7 +22598,7 @@
               <a:graphicData uri="http://schemas.openxmlformats.org/drawingml/2006/picture">
                 <pic:pic xmlns:pic="http://schemas.openxmlformats.org/drawingml/2006/picture">
                   <pic:nvPicPr>
-                    <pic:cNvPr id="1612775129" name="Gráfico 1612775129"/>
+                    <pic:cNvPr id="1319824235" name="Gráfico 1319824235"/>
                     <pic:cNvPicPr/>
                   </pic:nvPicPr>
                   <pic:blipFill>
@@ -22605,7 +22616,7 @@
                   <pic:spPr>
                     <a:xfrm>
                       <a:off x="0" y="0"/>
-                      <a:ext cx="5400040" cy="7468870"/>
+                      <a:ext cx="6009600" cy="6216170"/>
                     </a:xfrm>
                     <a:prstGeom prst="rect">
                       <a:avLst/>
@@ -22638,6 +22649,11 @@
         <w:t>: Diagrama E/R Núcleo principal de la votación</w:t>
       </w:r>
       <w:bookmarkEnd w:id="38"/>
+    </w:p>
+    <w:p>
+      <w:r>
+        <w:t>Los resultados de las votaciones se modelan y persisten como parte del núcleo del proceso electoral, al depender directamente de la votación y de las candidaturas asociadas. Por este motivo, las entidades encargadas de almacenar el resultado final del recuento y su desglose por candidatura se representan exclusivamente en el diagrama correspondiente al núcleo del sistema.</w:t>
+      </w:r>
       <w:r>
         <w:br w:type="page"/>
       </w:r>
@@ -22899,15 +22915,25 @@
         <w:t>Durante la fase de votación, la aplicación restringe las acciones del elector a la emisión de su voto, aplicando controles de pertenencia al censo y de unicidad.</w:t>
       </w:r>
       <w:r>
-        <w:t xml:space="preserve"> Una vez finalizado el proceso de la votación el recuento queda a la espera de una autorización explícita (reflejada en el modelo con </w:t>
-      </w:r>
-      <w:proofErr w:type="spellStart"/>
-      <w:r>
-        <w:t>RecuentoAutorizado</w:t>
-      </w:r>
-      <w:proofErr w:type="spellEnd"/>
-      <w:r>
-        <w:t>) y la intervención del usuario con rol de Mesa Electoral. Tras el recuento se actualiza el estado de la votación y se procede a la publicación, cerrando el ciclo.</w:t>
+        <w:t xml:space="preserve"> Una vez finalizado el proceso de la votación el recuento queda a la espera de una autorización explícita (reflejada en el modelo con RecuentoAutorizado) y la intervención del usuario con rol de Mesa Electoral. Tras el recuento se actualiza el estado de la votación y se</w:t>
+      </w:r>
+      <w:r>
+        <w:t xml:space="preserve"> persisten los resultados agregados</w:t>
+      </w:r>
+      <w:r>
+        <w:t xml:space="preserve"> proced</w:t>
+      </w:r>
+      <w:r>
+        <w:t>iendo posteriormente</w:t>
+      </w:r>
+      <w:r>
+        <w:t xml:space="preserve"> a la publicación</w:t>
+      </w:r>
+      <w:r>
+        <w:t xml:space="preserve"> de resultados</w:t>
+      </w:r>
+      <w:r>
+        <w:t>, cerrando el ciclo.</w:t>
       </w:r>
     </w:p>
     <w:p>
@@ -23102,11 +23128,9 @@
       <w:r>
         <w:t xml:space="preserve">Una vez finalizada la fase anterior, la etapa siguiente es la configuración de candidatura y campaña con responsable a cargo, la Junta Electoral e interviniendo posteriormente el </w:t>
       </w:r>
-      <w:proofErr w:type="gramStart"/>
-      <w:r>
-        <w:t>Director</w:t>
-      </w:r>
-      <w:proofErr w:type="gramEnd"/>
+      <w:r>
+        <w:t>director</w:t>
+      </w:r>
       <w:r>
         <w:t xml:space="preserve"> de Campaña en las comunicaciones con los electores.</w:t>
       </w:r>
@@ -23407,26 +23431,16 @@
       <w:r>
         <w:t xml:space="preserve">del resto de etapas previas de identificación y emisión del voto. Esto </w:t>
       </w:r>
-      <w:proofErr w:type="spellStart"/>
-      <w:r>
-        <w:t>esta</w:t>
-      </w:r>
-      <w:proofErr w:type="spellEnd"/>
+      <w:r>
+        <w:t>está</w:t>
+      </w:r>
       <w:r>
         <w:t xml:space="preserve"> motivado por seguridad y garantía del secreto de voto, para separar las identidades de los electores de los usuarios que procesan el recuento.</w:t>
       </w:r>
     </w:p>
     <w:p>
       <w:r>
-        <w:t xml:space="preserve">Una vez se acaba la votación, se bloquea la emisión de votos y se deja la votación en estado de recuento pendiente. Esto no significa se pueda proceder automáticamente al recuento, sino que se requiere de forma explícita que la Junta Electoral apruebe dicho recuento. Esto queda reflejado en el sistema mediante el indicador </w:t>
-      </w:r>
-      <w:proofErr w:type="spellStart"/>
-      <w:r>
-        <w:t>RecuentoAutorizado</w:t>
-      </w:r>
-      <w:proofErr w:type="spellEnd"/>
-      <w:r>
-        <w:t>, lo que otorga un control adicional que evita recuentos no supervisados o autorizados.</w:t>
+        <w:t>Una vez se acaba la votación, se bloquea la emisión de votos y se deja la votación en estado de recuento pendiente. Esto no significa se pueda proceder automáticamente al recuento, sino que se requiere de forma explícita que la Junta Electoral apruebe dicho recuento. Esto queda reflejado en el sistema mediante el indicador RecuentoAutorizado, lo que otorga un control adicional que evita recuentos no supervisados o autorizados.</w:t>
       </w:r>
     </w:p>
     <w:p>
@@ -23452,12 +23466,41 @@
         <w:t xml:space="preserve">Durante el recuento, el sistema impide el acceso a esta información a otros roles, incluidos el administrador del sistema y los electores, cumpliendo el principio de privilegio mínimo. Una vez procesado el </w:t>
       </w:r>
       <w:r>
-        <w:t>recuento los resultados se almacenan en la entidad correspondiente a la votación procesada, de forma agregada y sin posibilidad de reconstruir votos individuales.</w:t>
-      </w:r>
-    </w:p>
-    <w:p>
-      <w:r>
-        <w:t>Una vez finalizado este proceso y guardado el resultado, la Mesa Electoral procede en el día marcado en el calendario a la publicación de resultados, haciendo visible las estadísticas de la votación para que los usuarios seleccionados pueden consultarlos. Con esta acción se daría por completado el ciclo electoral, quedando guardado el proceso y bloqueando el cambio posterior de cualquier elemento preservando así el resultado obtenido y publicado.</w:t>
+        <w:t>recuento los resultados se almacenan en</w:t>
+      </w:r>
+      <w:r>
+        <w:t xml:space="preserve"> entidades específicas de persistencia de resultados, d</w:t>
+      </w:r>
+      <w:r>
+        <w:t>e forma agregada y sin posibilidad de reconstruir votos individuales.</w:t>
+      </w:r>
+    </w:p>
+    <w:p>
+      <w:r>
+        <w:t>Una vez finalizado este proceso y guardado el resultado, la Mesa Electoral procede en el día marcado en el calendario a la publicación de resultados, haciendo visible las estadísticas de la votación para que los usuarios seleccionados pueden consultarlos.</w:t>
+      </w:r>
+      <w:r>
+        <w:t xml:space="preserve"> </w:t>
+      </w:r>
+      <w:r>
+        <w:t>E</w:t>
+      </w:r>
+      <w:r>
+        <w:t>l resultado se persiste en base de datos mediante una entidad de resumen</w:t>
+      </w:r>
+      <w:r>
+        <w:t xml:space="preserve"> denominada ResultadoVotacion y en un desglose por candidatura en la entidad ResultadoCandidatura.</w:t>
+      </w:r>
+      <w:r>
+        <w:t xml:space="preserve"> </w:t>
+      </w:r>
+      <w:r>
+        <w:t>Esta persistencia permite separar el proceso de cálculo de la visualización posterior: la interfaz de consulta de resultados para el elector accede únicamente a los datos ya generados, sin recalcular ni acceder al detalle de votos individuales.</w:t>
+      </w:r>
+    </w:p>
+    <w:p>
+      <w:r>
+        <w:t>Con esta acción se daría por completado el ciclo electoral, quedando guardado el proceso y bloqueando el cambio posterior de cualquier elemento preservando así el resultado obtenido y publicado.</w:t>
       </w:r>
     </w:p>
     <w:p>
@@ -23485,10 +23528,10 @@
         </w:rPr>
         <w:lastRenderedPageBreak/>
         <w:drawing>
-          <wp:inline distT="0" distB="0" distL="0" distR="0" wp14:anchorId="3561E91D" wp14:editId="7F6A7F1B">
+          <wp:inline distT="0" distB="0" distL="0" distR="0" wp14:anchorId="6E72B741" wp14:editId="1FF5DC28">
             <wp:extent cx="5400040" cy="8328025"/>
             <wp:effectExtent l="0" t="0" r="0" b="0"/>
-            <wp:docPr id="2122985151" name="Gráfico 6"/>
+            <wp:docPr id="484783109" name="Gráfico 3"/>
             <wp:cNvGraphicFramePr>
               <a:graphicFrameLocks xmlns:a="http://schemas.openxmlformats.org/drawingml/2006/main" noChangeAspect="1"/>
             </wp:cNvGraphicFramePr>
@@ -23496,7 +23539,7 @@
               <a:graphicData uri="http://schemas.openxmlformats.org/drawingml/2006/picture">
                 <pic:pic xmlns:pic="http://schemas.openxmlformats.org/drawingml/2006/picture">
                   <pic:nvPicPr>
-                    <pic:cNvPr id="2122985151" name="Gráfico 2122985151"/>
+                    <pic:cNvPr id="484783109" name="Gráfico 484783109"/>
                     <pic:cNvPicPr/>
                   </pic:nvPicPr>
                   <pic:blipFill>
@@ -23563,11 +23606,13 @@
           <w:bCs/>
           <w:u w:val="single"/>
         </w:rPr>
-        <w:lastRenderedPageBreak/>
         <w:t>Gestión de incidencias durante el proceso</w:t>
       </w:r>
     </w:p>
     <w:p>
+      <w:pPr>
+        <w:ind w:left="708" w:hanging="708"/>
+      </w:pPr>
       <w:r>
         <w:t xml:space="preserve">Durante todo el ciclo electoral se pueden producir situaciones que requieran intervenciones o comunicaciones, tanto en fases previas como la publicación de censos hasta el mismo proceso de la votación. </w:t>
       </w:r>
@@ -23827,15 +23872,7 @@
     </w:p>
     <w:p>
       <w:r>
-        <w:t xml:space="preserve">El núcleo funcional se agrupa en la aplicación </w:t>
-      </w:r>
-      <w:proofErr w:type="spellStart"/>
-      <w:r>
-        <w:t>TeleVot</w:t>
-      </w:r>
-      <w:proofErr w:type="spellEnd"/>
-      <w:r>
-        <w:t>, donde se sitúan los elementos principales del proceso electoral: gestión de votaciones, control de fases, roles, emisión del voto</w:t>
+        <w:t>El núcleo funcional se agrupa en la aplicación TeleVot, donde se sitúan los elementos principales del proceso electoral: gestión de votaciones, control de fases, roles, emisión del voto</w:t>
       </w:r>
       <w:r>
         <w:t>, gestión del censo</w:t>
@@ -25007,18 +25044,8 @@
           <w:bCs/>
           <w:u w:val="single"/>
         </w:rPr>
-        <w:t xml:space="preserve">Módulo </w:t>
-      </w:r>
-      <w:proofErr w:type="spellStart"/>
-      <w:r>
-        <w:rPr>
-          <w:b/>
-          <w:bCs/>
-          <w:u w:val="single"/>
-        </w:rPr>
-        <w:t>TeleVot</w:t>
-      </w:r>
-      <w:proofErr w:type="spellEnd"/>
+        <w:t>Módulo TeleVot</w:t>
+      </w:r>
     </w:p>
     <w:p>
       <w:r>
@@ -25250,14 +25277,9 @@
         </w:r>
       </w:fldSimple>
       <w:r>
-        <w:t xml:space="preserve">: Detalle módulo </w:t>
-      </w:r>
-      <w:proofErr w:type="spellStart"/>
-      <w:r>
-        <w:t>TeleVot</w:t>
+        <w:t>: Detalle módulo TeleVot</w:t>
       </w:r>
       <w:bookmarkEnd w:id="53"/>
-      <w:proofErr w:type="spellEnd"/>
     </w:p>
     <w:p>
       <w:pPr>
@@ -25278,15 +25300,7 @@
     </w:p>
     <w:p>
       <w:r>
-        <w:t xml:space="preserve">Dentro de </w:t>
-      </w:r>
-      <w:proofErr w:type="spellStart"/>
-      <w:r>
-        <w:t>TeleVot</w:t>
-      </w:r>
-      <w:proofErr w:type="spellEnd"/>
-      <w:r>
-        <w:t>/</w:t>
+        <w:t>Dentro de TeleVot/</w:t>
       </w:r>
       <w:proofErr w:type="spellStart"/>
       <w:r>
@@ -25979,7 +25993,15 @@
         <w:tab/>
       </w:r>
       <w:r>
-        <w:t xml:space="preserve">-Django (framework principal): </w:t>
+        <w:t>-Django (</w:t>
+      </w:r>
+      <w:proofErr w:type="spellStart"/>
+      <w:r>
+        <w:t>framework</w:t>
+      </w:r>
+      <w:proofErr w:type="spellEnd"/>
+      <w:r>
+        <w:t xml:space="preserve"> principal): </w:t>
       </w:r>
       <w:proofErr w:type="spellStart"/>
       <w:r>
@@ -28817,6 +28839,7 @@
         <w:rPr>
           <w:noProof/>
         </w:rPr>
+        <w:lastRenderedPageBreak/>
         <w:drawing>
           <wp:inline distT="0" distB="0" distL="0" distR="0" wp14:anchorId="37BB3832" wp14:editId="06045706">
             <wp:extent cx="5400040" cy="3353435"/>
@@ -28877,56 +28900,56 @@
     </w:p>
     <w:p>
       <w:r>
+        <w:t xml:space="preserve">Una vez terminada la fase 0, el sistema </w:t>
+      </w:r>
+      <w:proofErr w:type="spellStart"/>
+      <w:r>
+        <w:t>esta</w:t>
+      </w:r>
+      <w:proofErr w:type="spellEnd"/>
+      <w:r>
+        <w:t xml:space="preserve"> preparado para que pueda iniciarse un proceso electoral. Además, garantizamos que existe un administrador operativo y uno o varios usuarios con rol de Junta Electoral. No hay todavía ninguna votación activa ni ningún censo creado. A partir de este punto el administrador deja el control del flujo del proceso en manos de la Junta Electoral que será el rol principal en la siguiente fase.</w:t>
+      </w:r>
+    </w:p>
+    <w:p>
+      <w:pPr>
+        <w:rPr>
+          <w:b/>
+          <w:bCs/>
+          <w:u w:val="single"/>
+        </w:rPr>
+      </w:pPr>
+      <w:r>
+        <w:rPr>
+          <w:b/>
+          <w:bCs/>
+          <w:u w:val="single"/>
+        </w:rPr>
+        <w:t>FASE 1: CREACIÓN DE LA VOTACIÓN</w:t>
+      </w:r>
+    </w:p>
+    <w:p>
+      <w:r>
+        <w:t>Esta fase marca el inicio formal del proceso electoral y es responsabilidad exclusiva de los usuarios con rol de Junta Electoral. En esta fase se define el marco general de la votación que se va a llevar a cabo, estableciendo sus características básicas y el calendario que regirá los tiempo del proceso.</w:t>
+      </w:r>
+    </w:p>
+    <w:p>
+      <w:r>
+        <w:t>Los miembros de la Junta Electoral acceden a la aplicación mediante sus credenciales personales desde la página principal como en la ilustración 23.</w:t>
+      </w:r>
+      <w:r>
+        <w:t xml:space="preserve"> Una vez autenticados, el sistema muestra un menú específico adaptado a su rol, desde el cual pueden gestionar las votaciones activas y crear nuevas convocatorias.</w:t>
+      </w:r>
+    </w:p>
+    <w:p>
+      <w:pPr>
+        <w:keepNext/>
+      </w:pPr>
+      <w:r>
+        <w:rPr>
+          <w:noProof/>
+        </w:rPr>
         <w:lastRenderedPageBreak/>
-        <w:t xml:space="preserve">Una vez terminada la fase 0, el sistema </w:t>
-      </w:r>
-      <w:proofErr w:type="spellStart"/>
-      <w:r>
-        <w:t>esta</w:t>
-      </w:r>
-      <w:proofErr w:type="spellEnd"/>
-      <w:r>
-        <w:t xml:space="preserve"> preparado para que pueda iniciarse un proceso electoral. Además, garantizamos que existe un administrador operativo y uno o varios usuarios con rol de Junta Electoral. No hay todavía ninguna votación activa ni ningún censo creado. A partir de este punto el administrador deja el control del flujo del proceso en manos de la Junta Electoral que será el rol principal en la siguiente fase.</w:t>
-      </w:r>
-    </w:p>
-    <w:p>
-      <w:pPr>
-        <w:rPr>
-          <w:b/>
-          <w:bCs/>
-          <w:u w:val="single"/>
-        </w:rPr>
-      </w:pPr>
-      <w:r>
-        <w:rPr>
-          <w:b/>
-          <w:bCs/>
-          <w:u w:val="single"/>
-        </w:rPr>
-        <w:t>FASE 1: CREACIÓN DE LA VOTACIÓN</w:t>
-      </w:r>
-    </w:p>
-    <w:p>
-      <w:r>
-        <w:t>Esta fase marca el inicio formal del proceso electoral y es responsabilidad exclusiva de los usuarios con rol de Junta Electoral. En esta fase se define el marco general de la votación que se va a llevar a cabo, estableciendo sus características básicas y el calendario que regirá los tiempo del proceso.</w:t>
-      </w:r>
-    </w:p>
-    <w:p>
-      <w:r>
-        <w:t>Los miembros de la Junta Electoral acceden a la aplicación mediante sus credenciales personales desde la página principal como en la ilustración 23.</w:t>
-      </w:r>
-      <w:r>
-        <w:t xml:space="preserve"> Una vez autenticados, el sistema muestra un menú específico adaptado a su rol, desde el cual pueden gestionar las votaciones activas y crear nuevas convocatorias.</w:t>
-      </w:r>
-    </w:p>
-    <w:p>
-      <w:pPr>
-        <w:keepNext/>
-      </w:pPr>
-      <w:r>
-        <w:rPr>
-          <w:noProof/>
-        </w:rPr>
         <w:drawing>
           <wp:inline distT="0" distB="0" distL="0" distR="0" wp14:anchorId="3572814D" wp14:editId="58F07635">
             <wp:extent cx="5400040" cy="3806190"/>
@@ -29788,47 +29811,47 @@
           <w:bCs/>
           <w:u w:val="single"/>
         </w:rPr>
+        <w:t>FASE 3: CANDIDATURAS Y CAMPAÑAS</w:t>
+      </w:r>
+    </w:p>
+    <w:p>
+      <w:r>
+        <w:t>En esta fase se definen las candidaturas que concurren a la votación y al periodo de campaña electoral. El definir candidaturas es tarea de la Junta Electoral asi como la asignación del director de campaña a una candidatura en concreto. Las labores de comunicación</w:t>
+      </w:r>
+      <w:r>
+        <w:t xml:space="preserve"> durante la campaña electoral recaen en el director de campaña que podrá comunicarse con los integrantes del censo asignado a la votación. Todavía no es posible la emisión del voto que será más adelante.</w:t>
+      </w:r>
+    </w:p>
+    <w:p>
+      <w:r>
+        <w:t>Una vez cerrado el censo, la Junta Electoral accede a la votación y procede a la creación de las candidaturas.</w:t>
+      </w:r>
+      <w:r>
+        <w:t xml:space="preserve"> En cada candidatura es necesario un nombre, el tipo de la candidatura (individual o </w:t>
+      </w:r>
+      <w:proofErr w:type="spellStart"/>
+      <w:r>
+        <w:t>multiple</w:t>
+      </w:r>
+      <w:proofErr w:type="spellEnd"/>
+      <w:r>
+        <w:t xml:space="preserve">) y una pequeña descripción. </w:t>
+      </w:r>
+    </w:p>
+    <w:p>
+      <w:r>
+        <w:t>Las candidaturas creadas quedan vinculadas a la votación correspondiente y serán las opciones disponibles para los electores durante la fase de votación.</w:t>
+      </w:r>
+      <w:r>
+        <w:t xml:space="preserve"> Dentro de manejar la votación encontramos el formulario para manejar las candidaturas.</w:t>
+      </w:r>
+    </w:p>
+    <w:p>
+      <w:pPr>
+        <w:keepNext/>
+      </w:pPr>
+      <w:r>
         <w:lastRenderedPageBreak/>
-        <w:t>FASE 3: CANDIDATURAS Y CAMPAÑAS</w:t>
-      </w:r>
-    </w:p>
-    <w:p>
-      <w:r>
-        <w:t>En esta fase se definen las candidaturas que concurren a la votación y al periodo de campaña electoral. El definir candidaturas es tarea de la Junta Electoral asi como la asignación del director de campaña a una candidatura en concreto. Las labores de comunicación</w:t>
-      </w:r>
-      <w:r>
-        <w:t xml:space="preserve"> durante la campaña electoral recaen en el director de campaña que podrá comunicarse con los integrantes del censo asignado a la votación. Todavía no es posible la emisión del voto que será más adelante.</w:t>
-      </w:r>
-    </w:p>
-    <w:p>
-      <w:r>
-        <w:t>Una vez cerrado el censo, la Junta Electoral accede a la votación y procede a la creación de las candidaturas.</w:t>
-      </w:r>
-      <w:r>
-        <w:t xml:space="preserve"> En cada candidatura es necesario un nombre, el tipo de la candidatura (individual o </w:t>
-      </w:r>
-      <w:proofErr w:type="spellStart"/>
-      <w:r>
-        <w:t>multiple</w:t>
-      </w:r>
-      <w:proofErr w:type="spellEnd"/>
-      <w:r>
-        <w:t xml:space="preserve">) y una pequeña descripción. </w:t>
-      </w:r>
-    </w:p>
-    <w:p>
-      <w:r>
-        <w:t>Las candidaturas creadas quedan vinculadas a la votación correspondiente y serán las opciones disponibles para los electores durante la fase de votación.</w:t>
-      </w:r>
-      <w:r>
-        <w:t xml:space="preserve"> Dentro de manejar la votación encontramos el formulario para manejar las candidaturas.</w:t>
-      </w:r>
-    </w:p>
-    <w:p>
-      <w:pPr>
-        <w:keepNext/>
-      </w:pPr>
-      <w:r>
         <w:t xml:space="preserve"> </w:t>
       </w:r>
       <w:r>
@@ -29895,39 +29918,39 @@
     </w:p>
     <w:p>
       <w:r>
+        <w:t>Una vez creada una candidatura podremos asociarla un director de campaña</w:t>
+      </w:r>
+      <w:r>
+        <w:t xml:space="preserve"> </w:t>
+      </w:r>
+      <w:r>
+        <w:t>que debe ser un usuario previamente registrado en el sistema.</w:t>
+      </w:r>
+      <w:r>
+        <w:t xml:space="preserve"> </w:t>
+      </w:r>
+      <w:r>
+        <w:t>Este rol es específico y limitado, y permite gestionar únicamente las comunicaciones asociada</w:t>
+      </w:r>
+      <w:r>
+        <w:t>s al censo de la votación, sin posibilidad de segmentación, para evitar sesgo o spam indebido</w:t>
+      </w:r>
+      <w:r>
+        <w:t>.</w:t>
+      </w:r>
+      <w:r>
+        <w:t xml:space="preserve"> </w:t>
+      </w:r>
+    </w:p>
+    <w:p>
+      <w:pPr>
+        <w:keepNext/>
+      </w:pPr>
+      <w:r>
+        <w:rPr>
+          <w:noProof/>
+        </w:rPr>
         <w:lastRenderedPageBreak/>
-        <w:t>Una vez creada una candidatura podremos asociarla un director de campaña</w:t>
-      </w:r>
-      <w:r>
-        <w:t xml:space="preserve"> </w:t>
-      </w:r>
-      <w:r>
-        <w:t>que debe ser un usuario previamente registrado en el sistema.</w:t>
-      </w:r>
-      <w:r>
-        <w:t xml:space="preserve"> </w:t>
-      </w:r>
-      <w:r>
-        <w:t>Este rol es específico y limitado, y permite gestionar únicamente las comunicaciones asociada</w:t>
-      </w:r>
-      <w:r>
-        <w:t>s al censo de la votación, sin posibilidad de segmentación, para evitar sesgo o spam indebido</w:t>
-      </w:r>
-      <w:r>
-        <w:t>.</w:t>
-      </w:r>
-      <w:r>
-        <w:t xml:space="preserve"> </w:t>
-      </w:r>
-    </w:p>
-    <w:p>
-      <w:pPr>
-        <w:keepNext/>
-      </w:pPr>
-      <w:r>
-        <w:rPr>
-          <w:noProof/>
-        </w:rPr>
         <w:drawing>
           <wp:inline distT="0" distB="0" distL="0" distR="0" wp14:anchorId="542424DA" wp14:editId="1CEBEFC3">
             <wp:extent cx="5295900" cy="1703705"/>
@@ -30074,32 +30097,29 @@
         <w:t>Al finalizar el periodo de campaña, el sistema bloquea automáticamente la posibilidad de enviar nuevas comunicaciones. A partir de este momento, las candidaturas quedan definidas y el proceso se prepara para la fase de votación</w:t>
       </w:r>
       <w:r>
-        <w:t xml:space="preserve">. Al acabar esta fase tenemos las </w:t>
-      </w:r>
+        <w:t>. Al acabar esta fase tenemos las candidaturas creadas y validadas, los electores han tenido las comunicaciones para conocer las candidaturas y el sistema está listo para la votación en sí misma.</w:t>
+      </w:r>
+    </w:p>
+    <w:p>
+      <w:pPr>
+        <w:rPr>
+          <w:b/>
+          <w:bCs/>
+          <w:u w:val="single"/>
+        </w:rPr>
+      </w:pPr>
+      <w:r>
+        <w:rPr>
+          <w:b/>
+          <w:bCs/>
+          <w:u w:val="single"/>
+        </w:rPr>
+        <w:t>FASE 4: VOTACIÓN</w:t>
+      </w:r>
+    </w:p>
+    <w:p>
       <w:r>
         <w:lastRenderedPageBreak/>
-        <w:t>candidaturas creadas y validadas, los electores han tenido las comunicaciones para conocer las candidaturas y el sistema está listo para la votación en sí misma.</w:t>
-      </w:r>
-    </w:p>
-    <w:p>
-      <w:pPr>
-        <w:rPr>
-          <w:b/>
-          <w:bCs/>
-          <w:u w:val="single"/>
-        </w:rPr>
-      </w:pPr>
-      <w:r>
-        <w:rPr>
-          <w:b/>
-          <w:bCs/>
-          <w:u w:val="single"/>
-        </w:rPr>
-        <w:t>FASE 4: VOTACIÓN</w:t>
-      </w:r>
-    </w:p>
-    <w:p>
-      <w:r>
         <w:t>Se corresponde con la fase central del proceso en la cual el elector emitirá su voto, pero todavía faltan algunas cosas antes de esto.</w:t>
       </w:r>
     </w:p>
@@ -31297,6 +31317,7 @@
       <w:bookmarkEnd w:id="97"/>
     </w:p>
     <w:sectPr>
+      <w:footerReference w:type="default" r:id="rId75"/>
       <w:pgSz w:w="11906" w:h="16838"/>
       <w:pgMar w:top="1417" w:right="1701" w:bottom="1417" w:left="1701" w:header="708" w:footer="708" w:gutter="0"/>
       <w:cols w:space="708"/>
@@ -31329,6 +31350,136 @@
     </w:p>
   </w:endnote>
 </w:endnotes>
+</file>
+
+<file path=word/footer1.xml><?xml version="1.0" encoding="utf-8"?>
+<w:ftr xmlns:wpc="http://schemas.microsoft.com/office/word/2010/wordprocessingCanvas" xmlns:cx="http://schemas.microsoft.com/office/drawing/2014/chartex" xmlns:cx1="http://schemas.microsoft.com/office/drawing/2015/9/8/chartex" xmlns:cx2="http://schemas.microsoft.com/office/drawing/2015/10/21/chartex" xmlns:cx3="http://schemas.microsoft.com/office/drawing/2016/5/9/chartex" xmlns:cx4="http://schemas.microsoft.com/office/drawing/2016/5/10/chartex" xmlns:cx5="http://schemas.microsoft.com/office/drawing/2016/5/11/chartex" xmlns:cx6="http://schemas.microsoft.com/office/drawing/2016/5/12/chartex" xmlns:cx7="http://schemas.microsoft.com/office/drawing/2016/5/13/chartex" xmlns:cx8="http://schemas.microsoft.com/office/drawing/2016/5/14/chartex" xmlns:mc="http://schemas.openxmlformats.org/markup-compatibility/2006" xmlns:aink="http://schemas.microsoft.com/office/drawing/2016/ink" xmlns:am3d="http://schemas.microsoft.com/office/drawing/2017/model3d" xmlns:o="urn:schemas-microsoft-com:office:office" xmlns:oel="http://schemas.microsoft.com/office/2019/extlst" xmlns:r="http://schemas.openxmlformats.org/officeDocument/2006/relationships" xmlns:m="http://schemas.openxmlformats.org/officeDocument/2006/math" xmlns:v="urn:schemas-microsoft-com:vml" xmlns:wp14="http://schemas.microsoft.com/office/word/2010/wordprocessingDrawing" xmlns:wp="http://schemas.openxmlformats.org/drawingml/2006/wordprocessingDrawing" xmlns:w10="urn:schemas-microsoft-com:office:word" xmlns:w="http://schemas.openxmlformats.org/wordprocessingml/2006/main" xmlns:w14="http://schemas.microsoft.com/office/word/2010/wordml" xmlns:w15="http://schemas.microsoft.com/office/word/2012/wordml" xmlns:w16cex="http://schemas.microsoft.com/office/word/2018/wordml/cex" xmlns:w16cid="http://schemas.microsoft.com/office/word/2016/wordml/cid" xmlns:w16="http://schemas.microsoft.com/office/word/2018/wordml" xmlns:w16du="http://schemas.microsoft.com/office/word/2023/wordml/word16du" xmlns:w16sdtdh="http://schemas.microsoft.com/office/word/2020/wordml/sdtdatahash" xmlns:w16sdtfl="http://schemas.microsoft.com/office/word/2024/wordml/sdtformatlock" xmlns:w16se="http://schemas.microsoft.com/office/word/2015/wordml/symex" xmlns:wpg="http://schemas.microsoft.com/office/word/2010/wordprocessingGroup" xmlns:wpi="http://schemas.microsoft.com/office/word/2010/wordprocessingInk" xmlns:wne="http://schemas.microsoft.com/office/word/2006/wordml" xmlns:wps="http://schemas.microsoft.com/office/word/2010/wordprocessingShape" mc:Ignorable="w14 w15 w16se w16cid w16 w16cex w16sdtdh w16sdtfl w16du wp14">
+  <w:p>
+    <w:pPr>
+      <w:tabs>
+        <w:tab w:val="center" w:pos="4550"/>
+        <w:tab w:val="left" w:pos="5818"/>
+      </w:tabs>
+      <w:ind w:right="260"/>
+      <w:jc w:val="right"/>
+      <w:rPr>
+        <w:color w:val="071320" w:themeColor="text2" w:themeShade="80"/>
+        <w:sz w:val="24"/>
+        <w:szCs w:val="24"/>
+      </w:rPr>
+    </w:pPr>
+    <w:r>
+      <w:rPr>
+        <w:color w:val="2C7FCE" w:themeColor="text2" w:themeTint="99"/>
+        <w:spacing w:val="60"/>
+        <w:sz w:val="24"/>
+        <w:szCs w:val="24"/>
+      </w:rPr>
+      <w:t>Página</w:t>
+    </w:r>
+    <w:r>
+      <w:rPr>
+        <w:color w:val="2C7FCE" w:themeColor="text2" w:themeTint="99"/>
+        <w:sz w:val="24"/>
+        <w:szCs w:val="24"/>
+      </w:rPr>
+      <w:t xml:space="preserve"> </w:t>
+    </w:r>
+    <w:r>
+      <w:rPr>
+        <w:color w:val="0A1D30" w:themeColor="text2" w:themeShade="BF"/>
+        <w:sz w:val="24"/>
+        <w:szCs w:val="24"/>
+      </w:rPr>
+      <w:fldChar w:fldCharType="begin"/>
+    </w:r>
+    <w:r>
+      <w:rPr>
+        <w:color w:val="0A1D30" w:themeColor="text2" w:themeShade="BF"/>
+        <w:sz w:val="24"/>
+        <w:szCs w:val="24"/>
+      </w:rPr>
+      <w:instrText>PAGE   \* MERGEFORMAT</w:instrText>
+    </w:r>
+    <w:r>
+      <w:rPr>
+        <w:color w:val="0A1D30" w:themeColor="text2" w:themeShade="BF"/>
+        <w:sz w:val="24"/>
+        <w:szCs w:val="24"/>
+      </w:rPr>
+      <w:fldChar w:fldCharType="separate"/>
+    </w:r>
+    <w:r>
+      <w:rPr>
+        <w:color w:val="0A1D30" w:themeColor="text2" w:themeShade="BF"/>
+        <w:sz w:val="24"/>
+        <w:szCs w:val="24"/>
+      </w:rPr>
+      <w:t>1</w:t>
+    </w:r>
+    <w:r>
+      <w:rPr>
+        <w:color w:val="0A1D30" w:themeColor="text2" w:themeShade="BF"/>
+        <w:sz w:val="24"/>
+        <w:szCs w:val="24"/>
+      </w:rPr>
+      <w:fldChar w:fldCharType="end"/>
+    </w:r>
+    <w:r>
+      <w:rPr>
+        <w:color w:val="0A1D30" w:themeColor="text2" w:themeShade="BF"/>
+        <w:sz w:val="24"/>
+        <w:szCs w:val="24"/>
+      </w:rPr>
+      <w:t xml:space="preserve"> | </w:t>
+    </w:r>
+    <w:r>
+      <w:rPr>
+        <w:color w:val="0A1D30" w:themeColor="text2" w:themeShade="BF"/>
+        <w:sz w:val="24"/>
+        <w:szCs w:val="24"/>
+      </w:rPr>
+      <w:fldChar w:fldCharType="begin"/>
+    </w:r>
+    <w:r>
+      <w:rPr>
+        <w:color w:val="0A1D30" w:themeColor="text2" w:themeShade="BF"/>
+        <w:sz w:val="24"/>
+        <w:szCs w:val="24"/>
+      </w:rPr>
+      <w:instrText>NUMPAGES  \* Arabic  \* MERGEFORMAT</w:instrText>
+    </w:r>
+    <w:r>
+      <w:rPr>
+        <w:color w:val="0A1D30" w:themeColor="text2" w:themeShade="BF"/>
+        <w:sz w:val="24"/>
+        <w:szCs w:val="24"/>
+      </w:rPr>
+      <w:fldChar w:fldCharType="separate"/>
+    </w:r>
+    <w:r>
+      <w:rPr>
+        <w:color w:val="0A1D30" w:themeColor="text2" w:themeShade="BF"/>
+        <w:sz w:val="24"/>
+        <w:szCs w:val="24"/>
+      </w:rPr>
+      <w:t>1</w:t>
+    </w:r>
+    <w:r>
+      <w:rPr>
+        <w:color w:val="0A1D30" w:themeColor="text2" w:themeShade="BF"/>
+        <w:sz w:val="24"/>
+        <w:szCs w:val="24"/>
+      </w:rPr>
+      <w:fldChar w:fldCharType="end"/>
+    </w:r>
+  </w:p>
+  <w:p>
+    <w:pPr>
+      <w:pStyle w:val="Piedepgina"/>
+    </w:pPr>
+  </w:p>
+</w:ftr>
 </file>
 
 <file path=word/footnotes.xml><?xml version="1.0" encoding="utf-8"?>
@@ -38714,6 +38865,50 @@
       <w:sz w:val="24"/>
       <w:szCs w:val="24"/>
     </w:rPr>
+  </w:style>
+  <w:style w:type="paragraph" w:styleId="Encabezado">
+    <w:name w:val="header"/>
+    <w:basedOn w:val="Normal"/>
+    <w:link w:val="EncabezadoCar"/>
+    <w:uiPriority w:val="99"/>
+    <w:unhideWhenUsed/>
+    <w:rsid w:val="0010785C"/>
+    <w:pPr>
+      <w:tabs>
+        <w:tab w:val="center" w:pos="4252"/>
+        <w:tab w:val="right" w:pos="8504"/>
+      </w:tabs>
+      <w:spacing w:after="0" w:line="240" w:lineRule="auto"/>
+    </w:pPr>
+  </w:style>
+  <w:style w:type="character" w:customStyle="1" w:styleId="EncabezadoCar">
+    <w:name w:val="Encabezado Car"/>
+    <w:basedOn w:val="Fuentedeprrafopredeter"/>
+    <w:link w:val="Encabezado"/>
+    <w:uiPriority w:val="99"/>
+    <w:rsid w:val="0010785C"/>
+  </w:style>
+  <w:style w:type="paragraph" w:styleId="Piedepgina">
+    <w:name w:val="footer"/>
+    <w:basedOn w:val="Normal"/>
+    <w:link w:val="PiedepginaCar"/>
+    <w:uiPriority w:val="99"/>
+    <w:unhideWhenUsed/>
+    <w:rsid w:val="0010785C"/>
+    <w:pPr>
+      <w:tabs>
+        <w:tab w:val="center" w:pos="4252"/>
+        <w:tab w:val="right" w:pos="8504"/>
+      </w:tabs>
+      <w:spacing w:after="0" w:line="240" w:lineRule="auto"/>
+    </w:pPr>
+  </w:style>
+  <w:style w:type="character" w:customStyle="1" w:styleId="PiedepginaCar">
+    <w:name w:val="Pie de página Car"/>
+    <w:basedOn w:val="Fuentedeprrafopredeter"/>
+    <w:link w:val="Piedepgina"/>
+    <w:uiPriority w:val="99"/>
+    <w:rsid w:val="0010785C"/>
   </w:style>
 </w:styles>
 </file>

</xml_diff>

<commit_message>
Cierre de tareas finales del proyecto y preparación de la versión de entrega
- Finalización de la documentación pendiente del proyecto.
- Actualización y reorganización de los materiales de apoyo para la guía de usuario.
- Revisión final de la presentación del TFG.
- Resubida y actualización del fichero Zotero con las referencias bibliográficas empleadas.
- Corrección de incidencias detectadas en el flujo de recuento de votaciones.
- Ajuste de los procesos de descifrado y validación criptográfica de votos.
- Corrección de la visualización de resultados y candidatura ganadora en la interfaz de mesa electoral.
- Revisión general y estabilización de la aplicación previa a la generación de la versión final.

Closes #1
Closes #38
Closes #42
Closes #43
</commit_message>
<xml_diff>
--- a/DocumentosTFG/Anexos TFG.docx
+++ b/DocumentosTFG/Anexos TFG.docx
@@ -14,7 +14,7 @@
           <w:shd w:val="clear" w:color="auto" w:fill="FFFFFF"/>
         </w:rPr>
         <w:drawing>
-          <wp:inline distT="0" distB="0" distL="0" distR="0" wp14:anchorId="6CBCFA8F" wp14:editId="3802DCC4">
+          <wp:inline distT="0" distB="0" distL="0" distR="0" wp14:anchorId="6CBCFA8F" wp14:editId="07354003">
             <wp:extent cx="5400040" cy="1184275"/>
             <wp:effectExtent l="0" t="0" r="0" b="0"/>
             <wp:docPr id="1764844086" name="Imagen 1" descr="Interfaz de usuario gráfica, Texto&#10;&#10;Descripción generada automáticamente con confianza media"/>
@@ -7730,9 +7730,9 @@
           <w:noProof/>
         </w:rPr>
         <w:drawing>
-          <wp:inline distT="0" distB="0" distL="0" distR="0" wp14:anchorId="21AD0FD3" wp14:editId="7EB5F517">
-            <wp:extent cx="5400040" cy="2089785"/>
-            <wp:effectExtent l="0" t="0" r="10160" b="5715"/>
+          <wp:inline distT="0" distB="0" distL="0" distR="0" wp14:anchorId="21AD0FD3" wp14:editId="1032C827">
+            <wp:extent cx="5400040" cy="2529192"/>
+            <wp:effectExtent l="0" t="0" r="10160" b="5080"/>
             <wp:docPr id="492701046" name="Gráfico 1">
               <a:extLst xmlns:a="http://schemas.openxmlformats.org/drawingml/2006/main">
                 <a:ext uri="{FF2B5EF4-FFF2-40B4-BE49-F238E27FC236}">
@@ -7794,6 +7794,7 @@
       </w:pPr>
       <w:bookmarkStart w:id="9" w:name="_Toc231410694"/>
       <w:r>
+        <w:lastRenderedPageBreak/>
         <w:t>A.3. Estudio de viabilidad</w:t>
       </w:r>
       <w:bookmarkEnd w:id="9"/>
@@ -7805,7 +7806,6 @@
     </w:p>
     <w:p>
       <w:r>
-        <w:lastRenderedPageBreak/>
         <w:t xml:space="preserve"> Al ser una APP para realizar votaciones con una seguridad viable como para una votación oficial y reconocida capaz de votarse tanto con certificados digitales reconocidos como con certificados </w:t>
       </w:r>
       <w:r>
@@ -8011,6 +8011,7 @@
         </w:numPr>
       </w:pPr>
       <w:r>
+        <w:lastRenderedPageBreak/>
         <w:t>Adaptable a cualquier tipo de organización.</w:t>
       </w:r>
     </w:p>
@@ -8059,7 +8060,6 @@
         </w:rPr>
       </w:pPr>
       <w:r>
-        <w:lastRenderedPageBreak/>
         <w:t xml:space="preserve">Organizaciones grandes como universidades, sindicatos, </w:t>
       </w:r>
       <w:r>
@@ -8620,6 +8620,7 @@
           </w:tcPr>
           <w:p>
             <w:r>
+              <w:lastRenderedPageBreak/>
               <w:t>Concepto</w:t>
             </w:r>
           </w:p>
@@ -8652,7 +8653,6 @@
           </w:tcPr>
           <w:p>
             <w:r>
-              <w:lastRenderedPageBreak/>
               <w:t>Servidor en la nube (VPS/Cloud básico)</w:t>
             </w:r>
           </w:p>
@@ -21763,7 +21763,6 @@
         <w:lastRenderedPageBreak/>
         <w:t xml:space="preserve">entidades, aplicar restricciones de integridad y facilitar los cambios en los esquemas de datos ya que es muy sencillo mediante los comandos </w:t>
       </w:r>
-      <w:proofErr w:type="spellStart"/>
       <w:r>
         <w:rPr>
           <w:rStyle w:val="ExtranjerismosCar"/>
@@ -21778,7 +21777,6 @@
         </w:rPr>
         <w:t>e</w:t>
       </w:r>
-      <w:proofErr w:type="spellEnd"/>
       <w:r>
         <w:t xml:space="preserve"> </w:t>
       </w:r>
@@ -25287,7 +25285,6 @@
           <w:numId w:val="39"/>
         </w:numPr>
       </w:pPr>
-      <w:proofErr w:type="spellStart"/>
       <w:r>
         <w:rPr>
           <w:rStyle w:val="ExtranjerismosCar"/>
@@ -25295,7 +25292,6 @@
         </w:rPr>
         <w:t>out</w:t>
       </w:r>
-      <w:proofErr w:type="spellEnd"/>
       <w:r>
         <w:t>/: directorio para almacenar las exportaciones de los ficheros de PlantUML, como los diagramas del anexo.</w:t>
       </w:r>
@@ -25919,15 +25915,7 @@
         <w:tab/>
       </w:r>
       <w:r>
-        <w:t>-</w:t>
-      </w:r>
-      <w:proofErr w:type="spellStart"/>
-      <w:r>
-        <w:t>cryptography</w:t>
-      </w:r>
-      <w:proofErr w:type="spellEnd"/>
-      <w:r>
-        <w:t xml:space="preserve"> (operaciones criptográficas): </w:t>
+        <w:t xml:space="preserve">-cryptography (operaciones criptográficas): </w:t>
       </w:r>
       <w:proofErr w:type="spellStart"/>
       <w:r>
@@ -25959,7 +25947,22 @@
           <w:i/>
           <w:iCs/>
         </w:rPr>
-        <w:t xml:space="preserve"> </w:t>
+        <w:t xml:space="preserve"> cryptography</w:t>
+      </w:r>
+    </w:p>
+    <w:p>
+      <w:pPr>
+        <w:ind w:left="1413" w:hanging="705"/>
+      </w:pPr>
+      <w:r>
+        <w:tab/>
+        <w:t xml:space="preserve">-openpyxl (tratamiento ficheros </w:t>
+      </w:r>
+      <w:r>
+        <w:t>Excel</w:t>
+      </w:r>
+      <w:r>
+        <w:t xml:space="preserve">): </w:t>
       </w:r>
       <w:proofErr w:type="spellStart"/>
       <w:r>
@@ -25967,73 +25970,32 @@
           <w:i/>
           <w:iCs/>
         </w:rPr>
-        <w:t>cryptography</w:t>
+        <w:t>pip</w:t>
       </w:r>
       <w:proofErr w:type="spellEnd"/>
-    </w:p>
-    <w:p>
-      <w:pPr>
-        <w:ind w:left="1413" w:hanging="705"/>
-      </w:pPr>
-      <w:r>
-        <w:tab/>
-        <w:t>-</w:t>
-      </w:r>
-      <w:proofErr w:type="spellStart"/>
-      <w:r>
-        <w:t>openpyxl</w:t>
-      </w:r>
-      <w:proofErr w:type="spellEnd"/>
-      <w:r>
-        <w:t xml:space="preserve"> (tratamiento ficheros </w:t>
-      </w:r>
-      <w:r>
-        <w:t>Excel</w:t>
-      </w:r>
-      <w:r>
-        <w:t xml:space="preserve">): </w:t>
-      </w:r>
-      <w:proofErr w:type="spellStart"/>
       <w:r>
         <w:rPr>
           <w:i/>
           <w:iCs/>
         </w:rPr>
-        <w:t>pip</w:t>
-      </w:r>
-      <w:proofErr w:type="spellEnd"/>
+        <w:t xml:space="preserve"> </w:t>
+      </w:r>
+      <w:proofErr w:type="spellStart"/>
       <w:r>
         <w:rPr>
           <w:i/>
           <w:iCs/>
         </w:rPr>
-        <w:t xml:space="preserve"> </w:t>
-      </w:r>
-      <w:proofErr w:type="spellStart"/>
+        <w:t>install</w:t>
+      </w:r>
+      <w:proofErr w:type="spellEnd"/>
       <w:r>
         <w:rPr>
           <w:i/>
           <w:iCs/>
         </w:rPr>
-        <w:t>install</w:t>
-      </w:r>
-      <w:proofErr w:type="spellEnd"/>
-      <w:r>
-        <w:rPr>
-          <w:i/>
-          <w:iCs/>
-        </w:rPr>
-        <w:t xml:space="preserve"> </w:t>
-      </w:r>
-      <w:proofErr w:type="spellStart"/>
-      <w:r>
-        <w:rPr>
-          <w:i/>
-          <w:iCs/>
-        </w:rPr>
-        <w:t>openpyxl</w:t>
-      </w:r>
-      <w:proofErr w:type="spellEnd"/>
+        <w:t xml:space="preserve"> openpyxl</w:t>
+      </w:r>
     </w:p>
     <w:p>
       <w:pPr>
@@ -26686,23 +26648,7 @@
         <w:t>Configuración del entorno de desarrollo y dependencias</w:t>
       </w:r>
       <w:r>
-        <w:t xml:space="preserve">, incluyendo Django, psycopg2, </w:t>
-      </w:r>
-      <w:proofErr w:type="spellStart"/>
-      <w:r>
-        <w:t>cryptography</w:t>
-      </w:r>
-      <w:proofErr w:type="spellEnd"/>
-      <w:r>
-        <w:t xml:space="preserve">, </w:t>
-      </w:r>
-      <w:proofErr w:type="spellStart"/>
-      <w:r>
-        <w:t>openpyxl</w:t>
-      </w:r>
-      <w:proofErr w:type="spellEnd"/>
-      <w:r>
-        <w:t xml:space="preserve"> y </w:t>
+        <w:t xml:space="preserve">, incluyendo Django, psycopg2, cryptography, openpyxl y </w:t>
       </w:r>
       <w:proofErr w:type="spellStart"/>
       <w:r>
@@ -26888,63 +26834,31 @@
           <w:i/>
           <w:iCs/>
         </w:rPr>
-        <w:t xml:space="preserve"> manage.py </w:t>
-      </w:r>
-      <w:proofErr w:type="spellStart"/>
-      <w:r>
+        <w:t xml:space="preserve"> manage.py makemigrations (prepara las modificaciones en los modelos)</w:t>
+      </w:r>
+    </w:p>
+    <w:p>
+      <w:pPr>
         <w:rPr>
           <w:i/>
           <w:iCs/>
         </w:rPr>
-        <w:t>makemigrations</w:t>
-      </w:r>
-      <w:proofErr w:type="spellEnd"/>
+      </w:pPr>
+      <w:proofErr w:type="spellStart"/>
       <w:r>
         <w:rPr>
           <w:i/>
           <w:iCs/>
         </w:rPr>
-        <w:t xml:space="preserve"> (prepara las modificaciones en los modelos)</w:t>
-      </w:r>
-    </w:p>
-    <w:p>
-      <w:pPr>
+        <w:t>python</w:t>
+      </w:r>
+      <w:proofErr w:type="spellEnd"/>
+      <w:r>
         <w:rPr>
           <w:i/>
           <w:iCs/>
         </w:rPr>
-      </w:pPr>
-      <w:proofErr w:type="spellStart"/>
-      <w:r>
-        <w:rPr>
-          <w:i/>
-          <w:iCs/>
-        </w:rPr>
-        <w:t>python</w:t>
-      </w:r>
-      <w:proofErr w:type="spellEnd"/>
-      <w:r>
-        <w:rPr>
-          <w:i/>
-          <w:iCs/>
-        </w:rPr>
-        <w:t xml:space="preserve"> manage.py </w:t>
-      </w:r>
-      <w:proofErr w:type="spellStart"/>
-      <w:r>
-        <w:rPr>
-          <w:i/>
-          <w:iCs/>
-        </w:rPr>
-        <w:t>migrate</w:t>
-      </w:r>
-      <w:proofErr w:type="spellEnd"/>
-      <w:r>
-        <w:rPr>
-          <w:i/>
-          <w:iCs/>
-        </w:rPr>
-        <w:t xml:space="preserve"> (ejecuta las modificaciones en los modelos)</w:t>
+        <w:t xml:space="preserve"> manage.py migrate (ejecuta las modificaciones en los modelos)</w:t>
       </w:r>
     </w:p>
     <w:p>
@@ -38277,6 +38191,7 @@
   <w:style w:type="character" w:default="1" w:styleId="Fuentedeprrafopredeter">
     <w:name w:val="Default Paragraph Font"/>
     <w:uiPriority w:val="1"/>
+    <w:semiHidden/>
     <w:unhideWhenUsed/>
   </w:style>
   <w:style w:type="table" w:default="1" w:styleId="Tablanormal">
@@ -39283,6 +39198,7 @@
   <c:externalData r:id="rId3">
     <c:autoUpdate val="0"/>
   </c:externalData>
+  <c:userShapes r:id="rId4"/>
 </c:chartSpace>
 </file>
 
@@ -39842,6 +39758,44 @@
 </cs:chartStyle>
 </file>
 
+<file path=word/drawings/drawing1.xml><?xml version="1.0" encoding="utf-8"?>
+<c:userShapes xmlns:c="http://schemas.openxmlformats.org/drawingml/2006/chart">
+  <cdr:relSizeAnchor xmlns:cdr="http://schemas.openxmlformats.org/drawingml/2006/chartDrawing">
+    <cdr:from>
+      <cdr:x>0</cdr:x>
+      <cdr:y>0</cdr:y>
+    </cdr:from>
+    <cdr:to>
+      <cdr:x>1</cdr:x>
+      <cdr:y>1</cdr:y>
+    </cdr:to>
+    <cdr:pic>
+      <cdr:nvPicPr>
+        <cdr:cNvPr id="2" name="chart"/>
+        <cdr:cNvPicPr>
+          <a:picLocks xmlns:a="http://schemas.openxmlformats.org/drawingml/2006/main" noChangeAspect="1"/>
+        </cdr:cNvPicPr>
+      </cdr:nvPicPr>
+      <cdr:blipFill>
+        <a:blip xmlns:a="http://schemas.openxmlformats.org/drawingml/2006/main" xmlns:r="http://schemas.openxmlformats.org/officeDocument/2006/relationships" r:embed="rId1"/>
+        <a:stretch xmlns:a="http://schemas.openxmlformats.org/drawingml/2006/main">
+          <a:fillRect/>
+        </a:stretch>
+      </cdr:blipFill>
+      <cdr:spPr>
+        <a:xfrm xmlns:a="http://schemas.openxmlformats.org/drawingml/2006/main">
+          <a:off x="0" y="0"/>
+          <a:ext cx="31146750" cy="15468600"/>
+        </a:xfrm>
+        <a:prstGeom xmlns:a="http://schemas.openxmlformats.org/drawingml/2006/main" prst="rect">
+          <a:avLst/>
+        </a:prstGeom>
+      </cdr:spPr>
+    </cdr:pic>
+  </cdr:relSizeAnchor>
+</c:userShapes>
+</file>
+
 <file path=word/theme/theme1.xml><?xml version="1.0" encoding="utf-8"?>
 <a:theme xmlns:a="http://schemas.openxmlformats.org/drawingml/2006/main" name="Tema de Office">
   <a:themeElements>

</xml_diff>